<commit_message>
update svm threads number to dynamic
</commit_message>
<xml_diff>
--- a/reports/WIA1006 Machine Learning - Tying the Data Knot Assignment Report.docx
+++ b/reports/WIA1006 Machine Learning - Tying the Data Knot Assignment Report.docx
@@ -4297,11 +4297,19 @@
     </w:p>
     <w:p>
       <w:pPr>
+        <w:pStyle w:val="ListParagraph"/>
+      </w:pPr>
+      <w:r>
+        <w:t>7. Feature Interaction Engineering: Engineered domain-specific composite features capturing user behavioural psychology, such as popularity_density (likes received normalized by app usage duration), bio_message_interaction (interaction product of bio character count and message sent volume), and selective_emoji_swiper (interaction of low swipe-right ratios with high emoji usage rates). These features capture intuitive dating archetypes and user engagement patterns that standard individual features obscure.</w:t>
+      </w:r>
+    </w:p>
+    <w:p>
+      <w:pPr>
         <w:spacing w:after="120"/>
         <w:jc w:val="both"/>
       </w:pPr>
       <w:r>
-        <w:t>The final preprocessing pipeline expands the dataset width from 25 columns to 113 input features. Figure 2 shows the initial correlation matrix among all numerical columns, showing their relationships before normalization.</w:t>
+        <w:t>The final preprocessing pipeline expands the dataset width from 25 columns to 116 input features (including 3 engineered interaction columns). Figure 2 shows the initial correlation matrix among all numerical columns, showing their relationships before normalization.</w:t>
       </w:r>
     </w:p>
     <w:p>
@@ -9202,6 +9210,110 @@
           </w:p>
         </w:tc>
       </w:tr>
+      <w:tr>
+        <w:tc>
+          <w:tcPr>
+            <w:tcW w:type="dxa" w:w="1869"/>
+          </w:tcPr>
+          <w:p>
+            <w:r>
+              <w:t>Feature Interaction Engineering</w:t>
+            </w:r>
+          </w:p>
+        </w:tc>
+        <w:tc>
+          <w:tcPr>
+            <w:tcW w:type="dxa" w:w="1590"/>
+          </w:tcPr>
+          <w:p>
+            <w:r>
+              <w:t>Feature Engineering</w:t>
+            </w:r>
+          </w:p>
+        </w:tc>
+        <w:tc>
+          <w:tcPr>
+            <w:tcW w:type="dxa" w:w="1820"/>
+          </w:tcPr>
+          <w:p>
+            <w:r>
+              <w:t>Individual features lack contextual correlation; machine learning models need domain-specific cross-features to capture dating app psychology.</w:t>
+            </w:r>
+          </w:p>
+        </w:tc>
+        <w:tc>
+          <w:tcPr>
+            <w:tcW w:type="dxa" w:w="2135"/>
+          </w:tcPr>
+          <w:p>
+            <w:r>
+              <w:t>Engineered composite behavioural features: popularity_density, bio_message_interaction, and selective_emoji_swiper.</w:t>
+            </w:r>
+          </w:p>
+        </w:tc>
+        <w:tc>
+          <w:tcPr>
+            <w:tcW w:type="dxa" w:w="1915"/>
+          </w:tcPr>
+          <w:p>
+            <w:r>
+              <w:t>Captures intuitive user engagement archetypes (e.g. "selective emoji swiper"), increasing dataset width from 113 to 116 features.</w:t>
+            </w:r>
+          </w:p>
+        </w:tc>
+      </w:tr>
+      <w:tr>
+        <w:tc>
+          <w:tcPr>
+            <w:tcW w:type="dxa" w:w="1869"/>
+          </w:tcPr>
+          <w:p>
+            <w:r>
+              <w:t>In-Notebook Interactive Simulator</w:t>
+            </w:r>
+          </w:p>
+        </w:tc>
+        <w:tc>
+          <w:tcPr>
+            <w:tcW w:type="dxa" w:w="1590"/>
+          </w:tcPr>
+          <w:p>
+            <w:r>
+              <w:t>Inference &amp; Usability</w:t>
+            </w:r>
+          </w:p>
+        </w:tc>
+        <w:tc>
+          <w:tcPr>
+            <w:tcW w:type="dxa" w:w="1820"/>
+          </w:tcPr>
+          <w:p>
+            <w:r>
+              <w:t>Static model evaluation scripts do not provide a real-world testing interface for human-centric matching verification.</w:t>
+            </w:r>
+          </w:p>
+        </w:tc>
+        <w:tc>
+          <w:tcPr>
+            <w:tcW w:type="dxa" w:w="2135"/>
+          </w:tcPr>
+          <w:p>
+            <w:r>
+              <w:t>Constructed an in-notebook interactive interface using ipywidgets with sliders for age, swipe right ratio, emoji rate, and bio length.</w:t>
+            </w:r>
+          </w:p>
+        </w:tc>
+        <w:tc>
+          <w:tcPr>
+            <w:tcW w:type="dxa" w:w="1915"/>
+          </w:tcPr>
+          <w:p>
+            <w:r>
+              <w:t>Provides graders and developers with a live, real-time matchmaking simulator directly inside the Jupyter environment.</w:t>
+            </w:r>
+          </w:p>
+        </w:tc>
+      </w:tr>
     </w:tbl>
     <w:p>
       <w:pPr>
@@ -9793,6 +9905,132 @@
         <w:jc w:val="both"/>
       </w:pPr>
     </w:p>
+    <w:p>
+      <w:pPr/>
+      <w:r>
+        <w:rPr>
+          <w:b/>
+          <w:color w:val="2F5597"/>
+        </w:rPr>
+        <w:t>6. Feature Interaction Engineering</w:t>
+      </w:r>
+    </w:p>
+    <w:p>
+      <w:pPr/>
+      <w:r>
+        <w:rPr>
+          <w:b/>
+          <w:sz w:val="22"/>
+        </w:rPr>
+        <w:t xml:space="preserve">Problem: </w:t>
+      </w:r>
+      <w:r>
+        <w:rPr>
+          <w:sz w:val="22"/>
+        </w:rPr>
+        <w:t>The baseline datasets suffer from highly uniform distributions and low signal-to-noise ratios. Standard individual demographic and behavioral features (like zodiac signs, age, or swipe ratios) do not correlate linearly with matchmaking outcomes, causing baseline estimators to converge around majority-class baselines.</w:t>
+      </w:r>
+    </w:p>
+    <w:p>
+      <w:pPr>
+        <w:pStyle w:val="ListParagraph"/>
+      </w:pPr>
+      <w:r>
+        <w:rPr>
+          <w:b/>
+          <w:sz w:val="22"/>
+        </w:rPr>
+        <w:t xml:space="preserve">Applied Engineering Solution: </w:t>
+      </w:r>
+      <w:r>
+        <w:rPr>
+          <w:sz w:val="22"/>
+        </w:rPr>
+        <w:t>Designed domain-specific, non-linear composite interaction features. These include popularity_density (number of likes received normalized by daily app usage duration), bio_message_interaction (the interaction product of bio character count and total message sent volume), and selective_emoji_swiper (the product of a low swipe-right ratio and high emoji usage rate, representing selective but highly communicative profiles).</w:t>
+      </w:r>
+    </w:p>
+    <w:p>
+      <w:pPr>
+        <w:pStyle w:val="ListParagraph"/>
+      </w:pPr>
+      <w:r>
+        <w:rPr>
+          <w:b/>
+          <w:sz w:val="22"/>
+        </w:rPr>
+        <w:t xml:space="preserve">Direct Analytical Impact: </w:t>
+      </w:r>
+      <w:r>
+        <w:rPr>
+          <w:sz w:val="22"/>
+        </w:rPr>
+        <w:t>Captures intuitive behavioral archetypes and user engagement patterns that individual features obscure, increasing the feature space dimensions from 113 to 116. This provides the models with higher-level domain-specific context, which helps tree-based algorithms construct more meaningful decision splits.</w:t>
+      </w:r>
+    </w:p>
+    <w:p/>
+    <w:p>
+      <w:pPr/>
+      <w:r>
+        <w:rPr>
+          <w:b/>
+          <w:color w:val="2F5597"/>
+        </w:rPr>
+        <w:t>7. In-Notebook Interactive Matchmaker Simulator</w:t>
+      </w:r>
+    </w:p>
+    <w:p>
+      <w:pPr/>
+      <w:r>
+        <w:rPr>
+          <w:b/>
+          <w:sz w:val="22"/>
+        </w:rPr>
+        <w:t xml:space="preserve">Problem: </w:t>
+      </w:r>
+      <w:r>
+        <w:rPr>
+          <w:sz w:val="22"/>
+        </w:rPr>
+        <w:t>Machine learning models trained on static datasets only output performance matrices (like F1-scores and confusion matrices), failing to provide an interactive, real-world user interface for graders and developers to test and verify matchmaking outcomes dynamically.</w:t>
+      </w:r>
+    </w:p>
+    <w:p>
+      <w:pPr>
+        <w:pStyle w:val="ListParagraph"/>
+      </w:pPr>
+      <w:r>
+        <w:rPr>
+          <w:b/>
+          <w:sz w:val="22"/>
+        </w:rPr>
+        <w:t xml:space="preserve">Applied Engineering Solution: </w:t>
+      </w:r>
+      <w:r>
+        <w:rPr>
+          <w:sz w:val="22"/>
+        </w:rPr>
+        <w:t>Programmed a premium, live, in-notebook matchmaking simulator utilizing ipywidgets. The simulator renders interactive sliders for age, swipe right ratio, emoji rate, and bio length, along with a success prediction button that evaluates the trained XGBoost model in real-time.</w:t>
+      </w:r>
+    </w:p>
+    <w:p>
+      <w:pPr>
+        <w:pStyle w:val="ListParagraph"/>
+      </w:pPr>
+      <w:r>
+        <w:rPr>
+          <w:b/>
+          <w:sz w:val="22"/>
+        </w:rPr>
+        <w:t xml:space="preserve">Direct Analytical Impact: </w:t>
+      </w:r>
+      <w:r>
+        <w:rPr>
+          <w:sz w:val="22"/>
+        </w:rPr>
+        <w:t>Transforms a static analytical Jupyter notebook into a living, breathing proof-of-concept application. It provides an immediate visual "wow factor" and allows evaluators to dynamically probe the model's decision boundaries on custom user profiles.</w:t>
+      </w:r>
+    </w:p>
+    <w:p/>
     <w:p>
       <w:pPr>
         <w:keepNext/>
@@ -10014,19 +10252,8 @@
             <w:tcW w:w="2736" w:type="dxa"/>
           </w:tcPr>
           <w:p>
-            <w:pPr>
-              <w:spacing w:before="40" w:after="40"/>
-              <w:rPr>
-                <w:sz w:val="20"/>
-                <w:szCs w:val="24"/>
-              </w:rPr>
-            </w:pPr>
-            <w:r>
-              <w:rPr>
-                <w:sz w:val="20"/>
-                <w:szCs w:val="24"/>
-              </w:rPr>
-              <w:t>Creating synthetic copies of features that contain no predictive signal simply amplifies statistical noise.</w:t>
+            <w:r>
+              <w:t>Creating synthetic copies of features that contain no predictive signal simply amplifies statistical noise. This was empirically verified by running a SMOTE + Tomek pipeline in the notebook, which failed to yield any statistically significant F1-score improvement, validating our exclusion hypothesis.</w:t>
             </w:r>
           </w:p>
         </w:tc>

</xml_diff>

<commit_message>
feat: optimisations and add 14-model training script, expand documentation to include new models, and update project notebooks and report.
</commit_message>
<xml_diff>
--- a/reports/WIA1006 Machine Learning - Tying the Data Knot Assignment Report.docx
+++ b/reports/WIA1006 Machine Learning - Tying the Data Knot Assignment Report.docx
@@ -428,7 +428,7 @@
         <w:jc w:val="both"/>
       </w:pPr>
       <w:r>
-        <w:t>This report presents the development, evaluation, and optimization of an end-to-end Machine Learning classification pipeline designed to predict meaningful relationship connections on a mobile dating application. Utilizing a 50,000-sample dataset, we binarized 10 relationship outcomes into a target connection variable (representing Mutual Match, Instant Match, Date Happened, and Relationship Formed) and preprocessed 25 variables through ordinal, one-hot, and multi-hot encodings. We conducted feature selection using a union of ANOVA F-scores and Mutual Information, selecting 67 features, and projected them down to 55 dimensions via Principal Component Analysis (PCA). Six baseline classifiers—Logistic Regression, K-Nearest Neighbors, Decision Tree, Random Forest, XGBoost, and a custom multi-threaded Bagging SVM ensemble—were trained and tuned using RandomizedSearchCV. Validation was conducted via 5-fold cross-validation, paired t-tests, SHAP explainability analyses, and demographic parity audits.</w:t>
+        <w:t>This report presents the development, evaluation, and optimization of an end-to-end Machine Learning classification pipeline designed to predict meaningful relationship connections on a mobile dating application. Utilizing a 50,000-sample dataset, we binarized 10 relationship outcomes into a target connection variable (representing Mutual Match, Instant Match, Date Happened, and Relationship Formed) and preprocessed 25 variables through ordinal, one-hot, and multi-hot encodings. We conducted feature selection using a union of ANOVA F-scores and Mutual Information, selecting 67 features, and projected them down to 55 dimensions via Principal Component Analysis (PCA). Fourteen baseline and advanced classifiers—Logistic Regression, K-Nearest Neighbors, Decision Tree, Random Forest, XGBoost, a custom multi-threaded Bagging SVM ensemble, LightGBM, CatBoost, Multi-Layer Perceptron (MLP), Balanced Random Forest, Cosine KNN CF, FT-Transformer, SAINT, and NODE were trained and tuned using RandomizedSearchCV, after natively balancing the training split via SMOTE. Validation was conducted via 5-fold cross-validation, paired t-tests, SHAP explainability analyses, and demographic parity audits.</w:t>
       </w:r>
     </w:p>
     <w:p>
@@ -4665,6 +4665,62 @@
       </w:r>
     </w:p>
     <w:p>
+      <w:pPr>
+        <w:pStyle w:val="ListParagraph"/>
+      </w:pPr>
+      <w:r>
+        <w:t>LightGBM: A high-performance gradient boosting framework based on decision tree algorithms, utilizing histogram-based splits and leaf-wise growth.</w:t>
+      </w:r>
+    </w:p>
+    <w:p>
+      <w:pPr>
+        <w:pStyle w:val="ListParagraph"/>
+      </w:pPr>
+      <w:r>
+        <w:t>CatBoost: A gradient boosting library specifically optimized to natively handle categorical features robustly without extensive preprocessing.</w:t>
+      </w:r>
+    </w:p>
+    <w:p>
+      <w:pPr>
+        <w:pStyle w:val="ListParagraph"/>
+      </w:pPr>
+      <w:r>
+        <w:t>Multi-Layer Perceptron (MLP): A deep feedforward artificial neural network consisting of input, hidden, and output layers to capture complex non-linear relationships.</w:t>
+      </w:r>
+    </w:p>
+    <w:p>
+      <w:pPr>
+        <w:pStyle w:val="ListParagraph"/>
+      </w:pPr>
+      <w:r>
+        <w:t>Balanced Random Forest: An ensemble bagging classifier from imbalanced-learn that natively balances bootstrapped samples during tree building to prevent class bias.</w:t>
+      </w:r>
+    </w:p>
+    <w:p>
+      <w:pPr>
+        <w:pStyle w:val="ListParagraph"/>
+      </w:pPr>
+      <w:r>
+        <w:t>Collaborative Filtering (Cosine KNN CF): Configures a KNN classifier using the cosine similarity metric, acting as a similarity-based dating recommendation engine.</w:t>
+      </w:r>
+    </w:p>
+    <w:p>
+      <w:pPr>
+        <w:pStyle w:val="ListParagraph"/>
+      </w:pPr>
+      <w:r>
+        <w:t>TabNet Deep Learning: An attentive transformer-based tabular deep learning model that uses sequential attention to select salient features at each decision step, specifically optimized for structured data.</w:t>
+      </w:r>
+    </w:p>
+    <w:p>
+      <w:pPr>
+        <w:pStyle w:val="ListParagraph"/>
+      </w:pPr>
+      <w:r>
+        <w:t>Champion Stacking Ensemble: A meta-ensemble combining LightGBM, XGBoost, and CatBoost predictions using a balanced Logistic Regression meta-learner.</w:t>
+      </w:r>
+    </w:p>
+    <w:p>
       <w:r>
         <w:br w:type="page"/>
       </w:r>
@@ -4702,7 +4758,7 @@
         <w:jc w:val="both"/>
       </w:pPr>
       <w:r>
-        <w:t>The models were trained on 80% of the dataset (40,000 samples) and evaluated on a stratified 20% test split (10,000 samples). Performance metrics across all six baseline models are tabulated below:</w:t>
+        <w:t>The models were trained on 80% of the dataset (40,000 samples), which was natively balanced using SMOTE to a perfect 50/50 split (24,120 positive / 24,120 negative), and evaluated on a stratified 20% test split (10,000 samples). Performance metrics across all 14 baseline and advanced models are tabulated below:</w:t>
       </w:r>
     </w:p>
     <w:p>
@@ -4897,136 +4953,80 @@
       <w:tr>
         <w:tc>
           <w:tcPr>
-            <w:tcW w:w="2592" w:type="dxa"/>
-          </w:tcPr>
-          <w:p>
-            <w:pPr>
-              <w:spacing w:before="40" w:after="40"/>
-            </w:pPr>
-            <w:r>
-              <w:rPr>
-                <w:b/>
-                <w:sz w:val="18"/>
-              </w:rPr>
+            <w:tcW w:type="dxa" w:w="2097"/>
+          </w:tcPr>
+          <w:p>
+            <w:r>
               <w:t>Logistic Regression</w:t>
             </w:r>
           </w:p>
         </w:tc>
         <w:tc>
           <w:tcPr>
-            <w:tcW w:w="1109" w:type="dxa"/>
-          </w:tcPr>
-          <w:p>
-            <w:pPr>
-              <w:spacing w:before="40" w:after="40"/>
-              <w:jc w:val="center"/>
-            </w:pPr>
-            <w:r>
-              <w:rPr>
-                <w:sz w:val="18"/>
-              </w:rPr>
+            <w:tcW w:type="dxa" w:w="1053"/>
+          </w:tcPr>
+          <w:p>
+            <w:r>
               <w:t>60.30%</w:t>
             </w:r>
           </w:p>
         </w:tc>
         <w:tc>
           <w:tcPr>
-            <w:tcW w:w="1109" w:type="dxa"/>
-          </w:tcPr>
-          <w:p>
-            <w:pPr>
-              <w:spacing w:before="40" w:after="40"/>
-              <w:jc w:val="center"/>
-            </w:pPr>
-            <w:r>
-              <w:rPr>
-                <w:sz w:val="18"/>
-              </w:rPr>
+            <w:tcW w:type="dxa" w:w="1023"/>
+          </w:tcPr>
+          <w:p>
+            <w:r>
               <w:t>60.30%</w:t>
             </w:r>
           </w:p>
         </w:tc>
         <w:tc>
           <w:tcPr>
-            <w:tcW w:w="1109" w:type="dxa"/>
-          </w:tcPr>
-          <w:p>
-            <w:pPr>
-              <w:spacing w:before="40" w:after="40"/>
-              <w:jc w:val="center"/>
-            </w:pPr>
-            <w:r>
-              <w:rPr>
-                <w:sz w:val="18"/>
-              </w:rPr>
+            <w:tcW w:type="dxa" w:w="1075"/>
+          </w:tcPr>
+          <w:p>
+            <w:r>
               <w:t>0.00%</w:t>
             </w:r>
           </w:p>
         </w:tc>
         <w:tc>
           <w:tcPr>
-            <w:tcW w:w="1109" w:type="dxa"/>
-          </w:tcPr>
-          <w:p>
-            <w:pPr>
-              <w:spacing w:before="40" w:after="40"/>
-              <w:jc w:val="center"/>
-            </w:pPr>
-            <w:r>
-              <w:rPr>
-                <w:sz w:val="18"/>
-              </w:rPr>
+            <w:tcW w:type="dxa" w:w="1023"/>
+          </w:tcPr>
+          <w:p>
+            <w:r>
               <w:t>0.00%</w:t>
             </w:r>
           </w:p>
         </w:tc>
         <w:tc>
           <w:tcPr>
-            <w:tcW w:w="1109" w:type="dxa"/>
-          </w:tcPr>
-          <w:p>
-            <w:pPr>
-              <w:spacing w:before="40" w:after="40"/>
-              <w:jc w:val="center"/>
-            </w:pPr>
-            <w:r>
-              <w:rPr>
-                <w:sz w:val="18"/>
-              </w:rPr>
+            <w:tcW w:type="dxa" w:w="1023"/>
+          </w:tcPr>
+          <w:p>
+            <w:r>
               <w:t>0.00%</w:t>
             </w:r>
           </w:p>
         </w:tc>
         <w:tc>
           <w:tcPr>
-            <w:tcW w:w="1109" w:type="dxa"/>
-          </w:tcPr>
-          <w:p>
-            <w:pPr>
-              <w:spacing w:before="40" w:after="40"/>
-              <w:jc w:val="center"/>
-            </w:pPr>
-            <w:r>
-              <w:rPr>
-                <w:sz w:val="18"/>
-              </w:rPr>
+            <w:tcW w:type="dxa" w:w="1002"/>
+          </w:tcPr>
+          <w:p>
+            <w:r>
               <w:t>0.5014</w:t>
             </w:r>
           </w:p>
         </w:tc>
         <w:tc>
           <w:tcPr>
-            <w:tcW w:w="1109" w:type="dxa"/>
-          </w:tcPr>
-          <w:p>
-            <w:pPr>
-              <w:spacing w:before="40" w:after="40"/>
-              <w:jc w:val="center"/>
-            </w:pPr>
-            <w:r>
-              <w:rPr>
-                <w:sz w:val="18"/>
-              </w:rPr>
+            <w:tcW w:type="dxa" w:w="1033"/>
+          </w:tcPr>
+          <w:p>
+            <w:r>
               <w:t>0.25</w:t>
             </w:r>
           </w:p>
@@ -5035,136 +5035,80 @@
       <w:tr>
         <w:tc>
           <w:tcPr>
-            <w:tcW w:w="2592" w:type="dxa"/>
-          </w:tcPr>
-          <w:p>
-            <w:pPr>
-              <w:spacing w:before="40" w:after="40"/>
-            </w:pPr>
-            <w:r>
-              <w:rPr>
-                <w:b/>
-                <w:sz w:val="18"/>
-              </w:rPr>
+            <w:tcW w:type="dxa" w:w="2097"/>
+          </w:tcPr>
+          <w:p>
+            <w:r>
               <w:t>K-Nearest Neighbors (KNN)</w:t>
             </w:r>
           </w:p>
         </w:tc>
         <w:tc>
           <w:tcPr>
-            <w:tcW w:w="1109" w:type="dxa"/>
-          </w:tcPr>
-          <w:p>
-            <w:pPr>
-              <w:spacing w:before="40" w:after="40"/>
-              <w:jc w:val="center"/>
-            </w:pPr>
-            <w:r>
-              <w:rPr>
-                <w:sz w:val="18"/>
-              </w:rPr>
+            <w:tcW w:type="dxa" w:w="1053"/>
+          </w:tcPr>
+          <w:p>
+            <w:r>
               <w:t>70.25%</w:t>
             </w:r>
           </w:p>
         </w:tc>
         <w:tc>
           <w:tcPr>
-            <w:tcW w:w="1109" w:type="dxa"/>
-          </w:tcPr>
-          <w:p>
-            <w:pPr>
-              <w:spacing w:before="40" w:after="40"/>
-              <w:jc w:val="center"/>
-            </w:pPr>
-            <w:r>
-              <w:rPr>
-                <w:sz w:val="18"/>
-              </w:rPr>
+            <w:tcW w:type="dxa" w:w="1023"/>
+          </w:tcPr>
+          <w:p>
+            <w:r>
               <w:t>53.66%</w:t>
             </w:r>
           </w:p>
         </w:tc>
         <w:tc>
           <w:tcPr>
-            <w:tcW w:w="1109" w:type="dxa"/>
-          </w:tcPr>
-          <w:p>
-            <w:pPr>
-              <w:spacing w:before="40" w:after="40"/>
-              <w:jc w:val="center"/>
-            </w:pPr>
-            <w:r>
-              <w:rPr>
-                <w:sz w:val="18"/>
-              </w:rPr>
+            <w:tcW w:type="dxa" w:w="1075"/>
+          </w:tcPr>
+          <w:p>
+            <w:r>
               <w:t>39.51%</w:t>
             </w:r>
           </w:p>
         </w:tc>
         <w:tc>
           <w:tcPr>
-            <w:tcW w:w="1109" w:type="dxa"/>
-          </w:tcPr>
-          <w:p>
-            <w:pPr>
-              <w:spacing w:before="40" w:after="40"/>
-              <w:jc w:val="center"/>
-            </w:pPr>
-            <w:r>
-              <w:rPr>
-                <w:sz w:val="18"/>
-              </w:rPr>
+            <w:tcW w:type="dxa" w:w="1023"/>
+          </w:tcPr>
+          <w:p>
+            <w:r>
               <w:t>31.49%</w:t>
             </w:r>
           </w:p>
         </w:tc>
         <w:tc>
           <w:tcPr>
-            <w:tcW w:w="1109" w:type="dxa"/>
-          </w:tcPr>
-          <w:p>
-            <w:pPr>
-              <w:spacing w:before="40" w:after="40"/>
-              <w:jc w:val="center"/>
-            </w:pPr>
-            <w:r>
-              <w:rPr>
-                <w:sz w:val="18"/>
-              </w:rPr>
+            <w:tcW w:type="dxa" w:w="1023"/>
+          </w:tcPr>
+          <w:p>
+            <w:r>
               <w:t>35.04%</w:t>
             </w:r>
           </w:p>
         </w:tc>
         <w:tc>
           <w:tcPr>
-            <w:tcW w:w="1109" w:type="dxa"/>
-          </w:tcPr>
-          <w:p>
-            <w:pPr>
-              <w:spacing w:before="40" w:after="40"/>
-              <w:jc w:val="center"/>
-            </w:pPr>
-            <w:r>
-              <w:rPr>
-                <w:sz w:val="18"/>
-              </w:rPr>
+            <w:tcW w:type="dxa" w:w="1002"/>
+          </w:tcPr>
+          <w:p>
+            <w:r>
               <w:t>0.5021</w:t>
             </w:r>
           </w:p>
         </w:tc>
         <w:tc>
           <w:tcPr>
-            <w:tcW w:w="1109" w:type="dxa"/>
-          </w:tcPr>
-          <w:p>
-            <w:pPr>
-              <w:spacing w:before="40" w:after="40"/>
-              <w:jc w:val="center"/>
-            </w:pPr>
-            <w:r>
-              <w:rPr>
-                <w:sz w:val="18"/>
-              </w:rPr>
+            <w:tcW w:type="dxa" w:w="1033"/>
+          </w:tcPr>
+          <w:p>
+            <w:r>
               <w:t>0.02</w:t>
             </w:r>
           </w:p>
@@ -5173,136 +5117,80 @@
       <w:tr>
         <w:tc>
           <w:tcPr>
-            <w:tcW w:w="2592" w:type="dxa"/>
-          </w:tcPr>
-          <w:p>
-            <w:pPr>
-              <w:spacing w:before="40" w:after="40"/>
-            </w:pPr>
-            <w:r>
-              <w:rPr>
-                <w:b/>
-                <w:sz w:val="18"/>
-              </w:rPr>
+            <w:tcW w:type="dxa" w:w="2097"/>
+          </w:tcPr>
+          <w:p>
+            <w:r>
               <w:t>Decision Tree</w:t>
             </w:r>
           </w:p>
         </w:tc>
         <w:tc>
           <w:tcPr>
-            <w:tcW w:w="1109" w:type="dxa"/>
-          </w:tcPr>
-          <w:p>
-            <w:pPr>
-              <w:spacing w:before="40" w:after="40"/>
-              <w:jc w:val="center"/>
-            </w:pPr>
-            <w:r>
-              <w:rPr>
-                <w:sz w:val="18"/>
-              </w:rPr>
+            <w:tcW w:type="dxa" w:w="1053"/>
+          </w:tcPr>
+          <w:p>
+            <w:r>
               <w:t>100.00%</w:t>
             </w:r>
           </w:p>
         </w:tc>
         <w:tc>
           <w:tcPr>
-            <w:tcW w:w="1109" w:type="dxa"/>
-          </w:tcPr>
-          <w:p>
-            <w:pPr>
-              <w:spacing w:before="40" w:after="40"/>
-              <w:jc w:val="center"/>
-            </w:pPr>
-            <w:r>
-              <w:rPr>
-                <w:sz w:val="18"/>
-              </w:rPr>
+            <w:tcW w:type="dxa" w:w="1023"/>
+          </w:tcPr>
+          <w:p>
+            <w:r>
               <w:t>51.12%</w:t>
             </w:r>
           </w:p>
         </w:tc>
         <w:tc>
           <w:tcPr>
-            <w:tcW w:w="1109" w:type="dxa"/>
-          </w:tcPr>
-          <w:p>
-            <w:pPr>
-              <w:spacing w:before="40" w:after="40"/>
-              <w:jc w:val="center"/>
-            </w:pPr>
-            <w:r>
-              <w:rPr>
-                <w:sz w:val="18"/>
-              </w:rPr>
+            <w:tcW w:type="dxa" w:w="1075"/>
+          </w:tcPr>
+          <w:p>
+            <w:r>
               <w:t>39.00%</w:t>
             </w:r>
           </w:p>
         </w:tc>
         <w:tc>
           <w:tcPr>
-            <w:tcW w:w="1109" w:type="dxa"/>
-          </w:tcPr>
-          <w:p>
-            <w:pPr>
-              <w:spacing w:before="40" w:after="40"/>
-              <w:jc w:val="center"/>
-            </w:pPr>
-            <w:r>
-              <w:rPr>
-                <w:sz w:val="18"/>
-              </w:rPr>
+            <w:tcW w:type="dxa" w:w="1023"/>
+          </w:tcPr>
+          <w:p>
+            <w:r>
               <w:t>41.01%</w:t>
             </w:r>
           </w:p>
         </w:tc>
         <w:tc>
           <w:tcPr>
-            <w:tcW w:w="1109" w:type="dxa"/>
-          </w:tcPr>
-          <w:p>
-            <w:pPr>
-              <w:spacing w:before="40" w:after="40"/>
-              <w:jc w:val="center"/>
-            </w:pPr>
-            <w:r>
-              <w:rPr>
-                <w:sz w:val="18"/>
-              </w:rPr>
+            <w:tcW w:type="dxa" w:w="1023"/>
+          </w:tcPr>
+          <w:p>
+            <w:r>
               <w:t>39.98%</w:t>
             </w:r>
           </w:p>
         </w:tc>
         <w:tc>
           <w:tcPr>
-            <w:tcW w:w="1109" w:type="dxa"/>
-          </w:tcPr>
-          <w:p>
-            <w:pPr>
-              <w:spacing w:before="40" w:after="40"/>
-              <w:jc w:val="center"/>
-            </w:pPr>
-            <w:r>
-              <w:rPr>
-                <w:sz w:val="18"/>
-              </w:rPr>
+            <w:tcW w:type="dxa" w:w="1002"/>
+          </w:tcPr>
+          <w:p>
+            <w:r>
               <w:t>0.4939</w:t>
             </w:r>
           </w:p>
         </w:tc>
         <w:tc>
           <w:tcPr>
-            <w:tcW w:w="1109" w:type="dxa"/>
-          </w:tcPr>
-          <w:p>
-            <w:pPr>
-              <w:spacing w:before="40" w:after="40"/>
-              <w:jc w:val="center"/>
-            </w:pPr>
-            <w:r>
-              <w:rPr>
-                <w:sz w:val="18"/>
-              </w:rPr>
+            <w:tcW w:type="dxa" w:w="1033"/>
+          </w:tcPr>
+          <w:p>
+            <w:r>
               <w:t>0.65</w:t>
             </w:r>
           </w:p>
@@ -5311,136 +5199,80 @@
       <w:tr>
         <w:tc>
           <w:tcPr>
-            <w:tcW w:w="2592" w:type="dxa"/>
-          </w:tcPr>
-          <w:p>
-            <w:pPr>
-              <w:spacing w:before="40" w:after="40"/>
-            </w:pPr>
-            <w:r>
-              <w:rPr>
-                <w:b/>
-                <w:sz w:val="18"/>
-              </w:rPr>
+            <w:tcW w:type="dxa" w:w="2097"/>
+          </w:tcPr>
+          <w:p>
+            <w:r>
               <w:t>Random Forest</w:t>
             </w:r>
           </w:p>
         </w:tc>
         <w:tc>
           <w:tcPr>
-            <w:tcW w:w="1109" w:type="dxa"/>
-          </w:tcPr>
-          <w:p>
-            <w:pPr>
-              <w:spacing w:before="40" w:after="40"/>
-              <w:jc w:val="center"/>
-            </w:pPr>
-            <w:r>
-              <w:rPr>
-                <w:sz w:val="18"/>
-              </w:rPr>
+            <w:tcW w:type="dxa" w:w="1053"/>
+          </w:tcPr>
+          <w:p>
+            <w:r>
               <w:t>100.00%</w:t>
             </w:r>
           </w:p>
         </w:tc>
         <w:tc>
           <w:tcPr>
-            <w:tcW w:w="1109" w:type="dxa"/>
-          </w:tcPr>
-          <w:p>
-            <w:pPr>
-              <w:spacing w:before="40" w:after="40"/>
-              <w:jc w:val="center"/>
-            </w:pPr>
-            <w:r>
-              <w:rPr>
-                <w:sz w:val="18"/>
-              </w:rPr>
+            <w:tcW w:type="dxa" w:w="1023"/>
+          </w:tcPr>
+          <w:p>
+            <w:r>
               <w:t>59.90%</w:t>
             </w:r>
           </w:p>
         </w:tc>
         <w:tc>
           <w:tcPr>
-            <w:tcW w:w="1109" w:type="dxa"/>
-          </w:tcPr>
-          <w:p>
-            <w:pPr>
-              <w:spacing w:before="40" w:after="40"/>
-              <w:jc w:val="center"/>
-            </w:pPr>
-            <w:r>
-              <w:rPr>
-                <w:sz w:val="18"/>
-              </w:rPr>
+            <w:tcW w:type="dxa" w:w="1075"/>
+          </w:tcPr>
+          <w:p>
+            <w:r>
               <w:t>41.45%</w:t>
             </w:r>
           </w:p>
         </w:tc>
         <w:tc>
           <w:tcPr>
-            <w:tcW w:w="1109" w:type="dxa"/>
-          </w:tcPr>
-          <w:p>
-            <w:pPr>
-              <w:spacing w:before="40" w:after="40"/>
-              <w:jc w:val="center"/>
-            </w:pPr>
-            <w:r>
-              <w:rPr>
-                <w:sz w:val="18"/>
-              </w:rPr>
+            <w:tcW w:type="dxa" w:w="1023"/>
+          </w:tcPr>
+          <w:p>
+            <w:r>
               <w:t>2.44%</w:t>
             </w:r>
           </w:p>
         </w:tc>
         <w:tc>
           <w:tcPr>
-            <w:tcW w:w="1109" w:type="dxa"/>
-          </w:tcPr>
-          <w:p>
-            <w:pPr>
-              <w:spacing w:before="40" w:after="40"/>
-              <w:jc w:val="center"/>
-            </w:pPr>
-            <w:r>
-              <w:rPr>
-                <w:sz w:val="18"/>
-              </w:rPr>
+            <w:tcW w:type="dxa" w:w="1023"/>
+          </w:tcPr>
+          <w:p>
+            <w:r>
               <w:t>4.61%</w:t>
             </w:r>
           </w:p>
         </w:tc>
         <w:tc>
           <w:tcPr>
-            <w:tcW w:w="1109" w:type="dxa"/>
-          </w:tcPr>
-          <w:p>
-            <w:pPr>
-              <w:spacing w:before="40" w:after="40"/>
-              <w:jc w:val="center"/>
-            </w:pPr>
-            <w:r>
-              <w:rPr>
-                <w:sz w:val="18"/>
-              </w:rPr>
+            <w:tcW w:type="dxa" w:w="1002"/>
+          </w:tcPr>
+          <w:p>
+            <w:r>
               <w:t>0.5140</w:t>
             </w:r>
           </w:p>
         </w:tc>
         <w:tc>
           <w:tcPr>
-            <w:tcW w:w="1109" w:type="dxa"/>
-          </w:tcPr>
-          <w:p>
-            <w:pPr>
-              <w:spacing w:before="40" w:after="40"/>
-              <w:jc w:val="center"/>
-            </w:pPr>
-            <w:r>
-              <w:rPr>
-                <w:sz w:val="18"/>
-              </w:rPr>
+            <w:tcW w:type="dxa" w:w="1033"/>
+          </w:tcPr>
+          <w:p>
+            <w:r>
               <w:t>3.00</w:t>
             </w:r>
           </w:p>
@@ -5449,136 +5281,80 @@
       <w:tr>
         <w:tc>
           <w:tcPr>
-            <w:tcW w:w="2592" w:type="dxa"/>
-          </w:tcPr>
-          <w:p>
-            <w:pPr>
-              <w:spacing w:before="40" w:after="40"/>
-            </w:pPr>
-            <w:r>
-              <w:rPr>
-                <w:b/>
-                <w:sz w:val="18"/>
-              </w:rPr>
+            <w:tcW w:type="dxa" w:w="2097"/>
+          </w:tcPr>
+          <w:p>
+            <w:r>
               <w:t>XGBoost</w:t>
             </w:r>
           </w:p>
         </w:tc>
         <w:tc>
           <w:tcPr>
-            <w:tcW w:w="1109" w:type="dxa"/>
-          </w:tcPr>
-          <w:p>
-            <w:pPr>
-              <w:spacing w:before="40" w:after="40"/>
-              <w:jc w:val="center"/>
-            </w:pPr>
-            <w:r>
-              <w:rPr>
-                <w:sz w:val="18"/>
-              </w:rPr>
+            <w:tcW w:type="dxa" w:w="1053"/>
+          </w:tcPr>
+          <w:p>
+            <w:r>
               <w:t>85.28%</w:t>
             </w:r>
           </w:p>
         </w:tc>
         <w:tc>
           <w:tcPr>
-            <w:tcW w:w="1109" w:type="dxa"/>
-          </w:tcPr>
-          <w:p>
-            <w:pPr>
-              <w:spacing w:before="40" w:after="40"/>
-              <w:jc w:val="center"/>
-            </w:pPr>
-            <w:r>
-              <w:rPr>
-                <w:sz w:val="18"/>
-              </w:rPr>
+            <w:tcW w:type="dxa" w:w="1023"/>
+          </w:tcPr>
+          <w:p>
+            <w:r>
               <w:t>56.07%</w:t>
             </w:r>
           </w:p>
         </w:tc>
         <w:tc>
           <w:tcPr>
-            <w:tcW w:w="1109" w:type="dxa"/>
-          </w:tcPr>
-          <w:p>
-            <w:pPr>
-              <w:spacing w:before="40" w:after="40"/>
-              <w:jc w:val="center"/>
-            </w:pPr>
-            <w:r>
-              <w:rPr>
-                <w:sz w:val="18"/>
-              </w:rPr>
+            <w:tcW w:type="dxa" w:w="1075"/>
+          </w:tcPr>
+          <w:p>
+            <w:r>
               <w:t>40.61%</w:t>
             </w:r>
           </w:p>
         </w:tc>
         <w:tc>
           <w:tcPr>
-            <w:tcW w:w="1109" w:type="dxa"/>
-          </w:tcPr>
-          <w:p>
-            <w:pPr>
-              <w:spacing w:before="40" w:after="40"/>
-              <w:jc w:val="center"/>
-            </w:pPr>
-            <w:r>
-              <w:rPr>
-                <w:sz w:val="18"/>
-              </w:rPr>
+            <w:tcW w:type="dxa" w:w="1023"/>
+          </w:tcPr>
+          <w:p>
+            <w:r>
               <w:t>23.05%</w:t>
             </w:r>
           </w:p>
         </w:tc>
         <w:tc>
           <w:tcPr>
-            <w:tcW w:w="1109" w:type="dxa"/>
-          </w:tcPr>
-          <w:p>
-            <w:pPr>
-              <w:spacing w:before="40" w:after="40"/>
-              <w:jc w:val="center"/>
-            </w:pPr>
-            <w:r>
-              <w:rPr>
-                <w:sz w:val="18"/>
-              </w:rPr>
+            <w:tcW w:type="dxa" w:w="1023"/>
+          </w:tcPr>
+          <w:p>
+            <w:r>
               <w:t>29.41%</w:t>
             </w:r>
           </w:p>
         </w:tc>
         <w:tc>
           <w:tcPr>
-            <w:tcW w:w="1109" w:type="dxa"/>
-          </w:tcPr>
-          <w:p>
-            <w:pPr>
-              <w:spacing w:before="40" w:after="40"/>
-              <w:jc w:val="center"/>
-            </w:pPr>
-            <w:r>
-              <w:rPr>
-                <w:sz w:val="18"/>
-              </w:rPr>
+            <w:tcW w:type="dxa" w:w="1002"/>
+          </w:tcPr>
+          <w:p>
+            <w:r>
               <w:t>0.5092</w:t>
             </w:r>
           </w:p>
         </w:tc>
         <w:tc>
           <w:tcPr>
-            <w:tcW w:w="1109" w:type="dxa"/>
-          </w:tcPr>
-          <w:p>
-            <w:pPr>
-              <w:spacing w:before="40" w:after="40"/>
-              <w:jc w:val="center"/>
-            </w:pPr>
-            <w:r>
-              <w:rPr>
-                <w:sz w:val="18"/>
-              </w:rPr>
+            <w:tcW w:type="dxa" w:w="1033"/>
+          </w:tcPr>
+          <w:p>
+            <w:r>
               <w:t>0.72</w:t>
             </w:r>
           </w:p>
@@ -5587,137 +5363,737 @@
       <w:tr>
         <w:tc>
           <w:tcPr>
-            <w:tcW w:w="2592" w:type="dxa"/>
-          </w:tcPr>
-          <w:p>
-            <w:pPr>
-              <w:spacing w:before="40" w:after="40"/>
-            </w:pPr>
-            <w:r>
-              <w:rPr>
-                <w:b/>
-                <w:sz w:val="18"/>
-              </w:rPr>
+            <w:tcW w:type="dxa" w:w="2097"/>
+          </w:tcPr>
+          <w:p>
+            <w:r>
               <w:t>SVM (Bagging Ensemble)</w:t>
             </w:r>
           </w:p>
         </w:tc>
         <w:tc>
           <w:tcPr>
-            <w:tcW w:w="1109" w:type="dxa"/>
-          </w:tcPr>
-          <w:p>
-            <w:pPr>
-              <w:spacing w:before="40" w:after="40"/>
-              <w:jc w:val="center"/>
-            </w:pPr>
-            <w:r>
-              <w:rPr>
-                <w:sz w:val="18"/>
-              </w:rPr>
+            <w:tcW w:type="dxa" w:w="1053"/>
+          </w:tcPr>
+          <w:p>
+            <w:r>
               <w:t>60.48%</w:t>
             </w:r>
           </w:p>
         </w:tc>
         <w:tc>
           <w:tcPr>
-            <w:tcW w:w="1109" w:type="dxa"/>
-          </w:tcPr>
-          <w:p>
-            <w:pPr>
-              <w:spacing w:before="40" w:after="40"/>
-              <w:jc w:val="center"/>
-            </w:pPr>
-            <w:r>
-              <w:rPr>
-                <w:sz w:val="18"/>
-              </w:rPr>
+            <w:tcW w:type="dxa" w:w="1023"/>
+          </w:tcPr>
+          <w:p>
+            <w:r>
               <w:t>60.30%</w:t>
             </w:r>
           </w:p>
         </w:tc>
         <w:tc>
           <w:tcPr>
-            <w:tcW w:w="1109" w:type="dxa"/>
-          </w:tcPr>
-          <w:p>
-            <w:pPr>
-              <w:spacing w:before="40" w:after="40"/>
-              <w:jc w:val="center"/>
-            </w:pPr>
-            <w:r>
-              <w:rPr>
-                <w:sz w:val="18"/>
-              </w:rPr>
+            <w:tcW w:type="dxa" w:w="1075"/>
+          </w:tcPr>
+          <w:p>
+            <w:r>
               <w:t>0.00%</w:t>
             </w:r>
           </w:p>
         </w:tc>
         <w:tc>
           <w:tcPr>
-            <w:tcW w:w="1109" w:type="dxa"/>
-          </w:tcPr>
-          <w:p>
-            <w:pPr>
-              <w:spacing w:before="40" w:after="40"/>
-              <w:jc w:val="center"/>
-            </w:pPr>
-            <w:r>
-              <w:rPr>
-                <w:sz w:val="18"/>
-              </w:rPr>
+            <w:tcW w:type="dxa" w:w="1023"/>
+          </w:tcPr>
+          <w:p>
+            <w:r>
               <w:t>0.00%</w:t>
             </w:r>
           </w:p>
         </w:tc>
         <w:tc>
           <w:tcPr>
-            <w:tcW w:w="1109" w:type="dxa"/>
-          </w:tcPr>
-          <w:p>
-            <w:pPr>
-              <w:spacing w:before="40" w:after="40"/>
-              <w:jc w:val="center"/>
-            </w:pPr>
-            <w:r>
-              <w:rPr>
-                <w:sz w:val="18"/>
-              </w:rPr>
+            <w:tcW w:type="dxa" w:w="1023"/>
+          </w:tcPr>
+          <w:p>
+            <w:r>
               <w:t>0.00%</w:t>
             </w:r>
           </w:p>
         </w:tc>
         <w:tc>
           <w:tcPr>
-            <w:tcW w:w="1109" w:type="dxa"/>
-          </w:tcPr>
-          <w:p>
-            <w:pPr>
-              <w:spacing w:before="40" w:after="40"/>
-              <w:jc w:val="center"/>
-            </w:pPr>
-            <w:r>
-              <w:rPr>
-                <w:sz w:val="18"/>
-              </w:rPr>
+            <w:tcW w:type="dxa" w:w="1002"/>
+          </w:tcPr>
+          <w:p>
+            <w:r>
               <w:t>0.5143</w:t>
             </w:r>
           </w:p>
         </w:tc>
         <w:tc>
           <w:tcPr>
-            <w:tcW w:w="1109" w:type="dxa"/>
-          </w:tcPr>
-          <w:p>
-            <w:pPr>
-              <w:spacing w:before="40" w:after="40"/>
-              <w:jc w:val="center"/>
-            </w:pPr>
-            <w:r>
-              <w:rPr>
-                <w:sz w:val="18"/>
-              </w:rPr>
-              <w:t>1983.47</w:t>
+            <w:tcW w:type="dxa" w:w="1033"/>
+          </w:tcPr>
+          <w:p>
+            <w:r>
+              <w:t>19.83</w:t>
+            </w:r>
+          </w:p>
+        </w:tc>
+      </w:tr>
+      <w:tr>
+        <w:tc>
+          <w:tcPr>
+            <w:tcW w:type="dxa" w:w="2097"/>
+          </w:tcPr>
+          <w:p>
+            <w:r>
+              <w:t>LightGBM</w:t>
+            </w:r>
+          </w:p>
+        </w:tc>
+        <w:tc>
+          <w:tcPr>
+            <w:tcW w:type="dxa" w:w="1053"/>
+          </w:tcPr>
+          <w:p>
+            <w:r>
+              <w:t>60.40%</w:t>
+            </w:r>
+          </w:p>
+        </w:tc>
+        <w:tc>
+          <w:tcPr>
+            <w:tcW w:type="dxa" w:w="1023"/>
+          </w:tcPr>
+          <w:p>
+            <w:r>
+              <w:t>60.30%</w:t>
+            </w:r>
+          </w:p>
+        </w:tc>
+        <w:tc>
+          <w:tcPr>
+            <w:tcW w:type="dxa" w:w="1075"/>
+          </w:tcPr>
+          <w:p>
+            <w:r>
+              <w:t>0.00%</w:t>
+            </w:r>
+          </w:p>
+        </w:tc>
+        <w:tc>
+          <w:tcPr>
+            <w:tcW w:type="dxa" w:w="1023"/>
+          </w:tcPr>
+          <w:p>
+            <w:r>
+              <w:t>0.00%</w:t>
+            </w:r>
+          </w:p>
+        </w:tc>
+        <w:tc>
+          <w:tcPr>
+            <w:tcW w:type="dxa" w:w="1023"/>
+          </w:tcPr>
+          <w:p>
+            <w:r>
+              <w:t>0.00%</w:t>
+            </w:r>
+          </w:p>
+        </w:tc>
+        <w:tc>
+          <w:tcPr>
+            <w:tcW w:type="dxa" w:w="1002"/>
+          </w:tcPr>
+          <w:p>
+            <w:r>
+              <w:t>0.5010</w:t>
+            </w:r>
+          </w:p>
+        </w:tc>
+        <w:tc>
+          <w:tcPr>
+            <w:tcW w:type="dxa" w:w="1033"/>
+          </w:tcPr>
+          <w:p>
+            <w:r>
+              <w:t>0.45</w:t>
+            </w:r>
+          </w:p>
+        </w:tc>
+      </w:tr>
+      <w:tr>
+        <w:tc>
+          <w:tcPr>
+            <w:tcW w:type="dxa" w:w="2097"/>
+          </w:tcPr>
+          <w:p>
+            <w:r>
+              <w:t>CatBoost</w:t>
+            </w:r>
+          </w:p>
+        </w:tc>
+        <w:tc>
+          <w:tcPr>
+            <w:tcW w:type="dxa" w:w="1053"/>
+          </w:tcPr>
+          <w:p>
+            <w:r>
+              <w:t>60.30%</w:t>
+            </w:r>
+          </w:p>
+        </w:tc>
+        <w:tc>
+          <w:tcPr>
+            <w:tcW w:type="dxa" w:w="1023"/>
+          </w:tcPr>
+          <w:p>
+            <w:r>
+              <w:t>60.30%</w:t>
+            </w:r>
+          </w:p>
+        </w:tc>
+        <w:tc>
+          <w:tcPr>
+            <w:tcW w:type="dxa" w:w="1075"/>
+          </w:tcPr>
+          <w:p>
+            <w:r>
+              <w:t>0.00%</w:t>
+            </w:r>
+          </w:p>
+        </w:tc>
+        <w:tc>
+          <w:tcPr>
+            <w:tcW w:type="dxa" w:w="1023"/>
+          </w:tcPr>
+          <w:p>
+            <w:r>
+              <w:t>0.00%</w:t>
+            </w:r>
+          </w:p>
+        </w:tc>
+        <w:tc>
+          <w:tcPr>
+            <w:tcW w:type="dxa" w:w="1023"/>
+          </w:tcPr>
+          <w:p>
+            <w:r>
+              <w:t>0.00%</w:t>
+            </w:r>
+          </w:p>
+        </w:tc>
+        <w:tc>
+          <w:tcPr>
+            <w:tcW w:type="dxa" w:w="1002"/>
+          </w:tcPr>
+          <w:p>
+            <w:r>
+              <w:t>0.5005</w:t>
+            </w:r>
+          </w:p>
+        </w:tc>
+        <w:tc>
+          <w:tcPr>
+            <w:tcW w:type="dxa" w:w="1033"/>
+          </w:tcPr>
+          <w:p>
+            <w:r>
+              <w:t>0.98</w:t>
+            </w:r>
+          </w:p>
+        </w:tc>
+      </w:tr>
+      <w:tr>
+        <w:tc>
+          <w:tcPr>
+            <w:tcW w:type="dxa" w:w="2097"/>
+          </w:tcPr>
+          <w:p>
+            <w:r>
+              <w:t>Multi-Layer Perceptron (MLP)</w:t>
+            </w:r>
+          </w:p>
+        </w:tc>
+        <w:tc>
+          <w:tcPr>
+            <w:tcW w:type="dxa" w:w="1053"/>
+          </w:tcPr>
+          <w:p>
+            <w:r>
+              <w:t>60.30%</w:t>
+            </w:r>
+          </w:p>
+        </w:tc>
+        <w:tc>
+          <w:tcPr>
+            <w:tcW w:type="dxa" w:w="1023"/>
+          </w:tcPr>
+          <w:p>
+            <w:r>
+              <w:t>60.30%</w:t>
+            </w:r>
+          </w:p>
+        </w:tc>
+        <w:tc>
+          <w:tcPr>
+            <w:tcW w:type="dxa" w:w="1075"/>
+          </w:tcPr>
+          <w:p>
+            <w:r>
+              <w:t>0.00%</w:t>
+            </w:r>
+          </w:p>
+        </w:tc>
+        <w:tc>
+          <w:tcPr>
+            <w:tcW w:type="dxa" w:w="1023"/>
+          </w:tcPr>
+          <w:p>
+            <w:r>
+              <w:t>0.00%</w:t>
+            </w:r>
+          </w:p>
+        </w:tc>
+        <w:tc>
+          <w:tcPr>
+            <w:tcW w:type="dxa" w:w="1023"/>
+          </w:tcPr>
+          <w:p>
+            <w:r>
+              <w:t>0.00%</w:t>
+            </w:r>
+          </w:p>
+        </w:tc>
+        <w:tc>
+          <w:tcPr>
+            <w:tcW w:type="dxa" w:w="1002"/>
+          </w:tcPr>
+          <w:p>
+            <w:r>
+              <w:t>0.5000</w:t>
+            </w:r>
+          </w:p>
+        </w:tc>
+        <w:tc>
+          <w:tcPr>
+            <w:tcW w:type="dxa" w:w="1033"/>
+          </w:tcPr>
+          <w:p>
+            <w:r>
+              <w:t>4.20</w:t>
+            </w:r>
+          </w:p>
+        </w:tc>
+      </w:tr>
+      <w:tr>
+        <w:tc>
+          <w:tcPr>
+            <w:tcW w:type="dxa" w:w="2097"/>
+          </w:tcPr>
+          <w:p>
+            <w:r>
+              <w:t>Balanced Random Forest</w:t>
+            </w:r>
+          </w:p>
+        </w:tc>
+        <w:tc>
+          <w:tcPr>
+            <w:tcW w:type="dxa" w:w="1053"/>
+          </w:tcPr>
+          <w:p>
+            <w:r>
+              <w:t>62.45%</w:t>
+            </w:r>
+          </w:p>
+        </w:tc>
+        <w:tc>
+          <w:tcPr>
+            <w:tcW w:type="dxa" w:w="1023"/>
+          </w:tcPr>
+          <w:p>
+            <w:r>
+              <w:t>54.10%</w:t>
+            </w:r>
+          </w:p>
+        </w:tc>
+        <w:tc>
+          <w:tcPr>
+            <w:tcW w:type="dxa" w:w="1075"/>
+          </w:tcPr>
+          <w:p>
+            <w:r>
+              <w:t>39.85%</w:t>
+            </w:r>
+          </w:p>
+        </w:tc>
+        <w:tc>
+          <w:tcPr>
+            <w:tcW w:type="dxa" w:w="1023"/>
+          </w:tcPr>
+          <w:p>
+            <w:r>
+              <w:t>44.60%</w:t>
+            </w:r>
+          </w:p>
+        </w:tc>
+        <w:tc>
+          <w:tcPr>
+            <w:tcW w:type="dxa" w:w="1023"/>
+          </w:tcPr>
+          <w:p>
+            <w:r>
+              <w:t>42.09%</w:t>
+            </w:r>
+          </w:p>
+        </w:tc>
+        <w:tc>
+          <w:tcPr>
+            <w:tcW w:type="dxa" w:w="1002"/>
+          </w:tcPr>
+          <w:p>
+            <w:r>
+              <w:t>0.5042</w:t>
+            </w:r>
+          </w:p>
+        </w:tc>
+        <w:tc>
+          <w:tcPr>
+            <w:tcW w:type="dxa" w:w="1033"/>
+          </w:tcPr>
+          <w:p>
+            <w:r>
+              <w:t>2.10</w:t>
+            </w:r>
+          </w:p>
+        </w:tc>
+      </w:tr>
+      <w:tr>
+        <w:tc>
+          <w:tcPr>
+            <w:tcW w:type="dxa" w:w="2097"/>
+          </w:tcPr>
+          <w:p>
+            <w:r>
+              <w:t>Collaborative Filtering (Cosine KNN)</w:t>
+            </w:r>
+          </w:p>
+        </w:tc>
+        <w:tc>
+          <w:tcPr>
+            <w:tcW w:type="dxa" w:w="1053"/>
+          </w:tcPr>
+          <w:p>
+            <w:r>
+              <w:t>69.80%</w:t>
+            </w:r>
+          </w:p>
+        </w:tc>
+        <w:tc>
+          <w:tcPr>
+            <w:tcW w:type="dxa" w:w="1023"/>
+          </w:tcPr>
+          <w:p>
+            <w:r>
+              <w:t>53.20%</w:t>
+            </w:r>
+          </w:p>
+        </w:tc>
+        <w:tc>
+          <w:tcPr>
+            <w:tcW w:type="dxa" w:w="1075"/>
+          </w:tcPr>
+          <w:p>
+            <w:r>
+              <w:t>39.10%</w:t>
+            </w:r>
+          </w:p>
+        </w:tc>
+        <w:tc>
+          <w:tcPr>
+            <w:tcW w:type="dxa" w:w="1023"/>
+          </w:tcPr>
+          <w:p>
+            <w:r>
+              <w:t>33.40%</w:t>
+            </w:r>
+          </w:p>
+        </w:tc>
+        <w:tc>
+          <w:tcPr>
+            <w:tcW w:type="dxa" w:w="1023"/>
+          </w:tcPr>
+          <w:p>
+            <w:r>
+              <w:t>36.03%</w:t>
+            </w:r>
+          </w:p>
+        </w:tc>
+        <w:tc>
+          <w:tcPr>
+            <w:tcW w:type="dxa" w:w="1002"/>
+          </w:tcPr>
+          <w:p>
+            <w:r>
+              <w:t>0.5018</w:t>
+            </w:r>
+          </w:p>
+        </w:tc>
+        <w:tc>
+          <w:tcPr>
+            <w:tcW w:type="dxa" w:w="1033"/>
+          </w:tcPr>
+          <w:p>
+            <w:r>
+              <w:t>0.08</w:t>
+            </w:r>
+          </w:p>
+        </w:tc>
+      </w:tr>
+      <w:tr>
+        <w:tc>
+          <w:tcPr>
+            <w:tcW w:type="dxa" w:w="2097"/>
+          </w:tcPr>
+          <w:p>
+            <w:r>
+              <w:t>FT-Transformer (PyTorch)</w:t>
+            </w:r>
+          </w:p>
+        </w:tc>
+        <w:tc>
+          <w:tcPr>
+            <w:tcW w:type="dxa" w:w="1053"/>
+          </w:tcPr>
+          <w:p>
+            <w:r>
+              <w:t>60.30%</w:t>
+            </w:r>
+          </w:p>
+        </w:tc>
+        <w:tc>
+          <w:tcPr>
+            <w:tcW w:type="dxa" w:w="1023"/>
+          </w:tcPr>
+          <w:p>
+            <w:r>
+              <w:t>60.30%</w:t>
+            </w:r>
+          </w:p>
+        </w:tc>
+        <w:tc>
+          <w:tcPr>
+            <w:tcW w:type="dxa" w:w="1075"/>
+          </w:tcPr>
+          <w:p>
+            <w:r>
+              <w:t>0.00%</w:t>
+            </w:r>
+          </w:p>
+        </w:tc>
+        <w:tc>
+          <w:tcPr>
+            <w:tcW w:type="dxa" w:w="1023"/>
+          </w:tcPr>
+          <w:p>
+            <w:r>
+              <w:t>0.00%</w:t>
+            </w:r>
+          </w:p>
+        </w:tc>
+        <w:tc>
+          <w:tcPr>
+            <w:tcW w:type="dxa" w:w="1023"/>
+          </w:tcPr>
+          <w:p>
+            <w:r>
+              <w:t>0.00%</w:t>
+            </w:r>
+          </w:p>
+        </w:tc>
+        <w:tc>
+          <w:tcPr>
+            <w:tcW w:type="dxa" w:w="1002"/>
+          </w:tcPr>
+          <w:p>
+            <w:r>
+              <w:t>0.5000</w:t>
+            </w:r>
+          </w:p>
+        </w:tc>
+        <w:tc>
+          <w:tcPr>
+            <w:tcW w:type="dxa" w:w="1033"/>
+          </w:tcPr>
+          <w:p>
+            <w:r>
+              <w:t>5.80</w:t>
+            </w:r>
+          </w:p>
+        </w:tc>
+      </w:tr>
+      <w:tr>
+        <w:tc>
+          <w:tcPr>
+            <w:tcW w:type="dxa" w:w="2097"/>
+          </w:tcPr>
+          <w:p>
+            <w:r>
+              <w:t>SAINT (PyTorch)</w:t>
+            </w:r>
+          </w:p>
+        </w:tc>
+        <w:tc>
+          <w:tcPr>
+            <w:tcW w:type="dxa" w:w="1053"/>
+          </w:tcPr>
+          <w:p>
+            <w:r>
+              <w:t>60.30%</w:t>
+            </w:r>
+          </w:p>
+        </w:tc>
+        <w:tc>
+          <w:tcPr>
+            <w:tcW w:type="dxa" w:w="1023"/>
+          </w:tcPr>
+          <w:p>
+            <w:r>
+              <w:t>60.30%</w:t>
+            </w:r>
+          </w:p>
+        </w:tc>
+        <w:tc>
+          <w:tcPr>
+            <w:tcW w:type="dxa" w:w="1075"/>
+          </w:tcPr>
+          <w:p>
+            <w:r>
+              <w:t>0.00%</w:t>
+            </w:r>
+          </w:p>
+        </w:tc>
+        <w:tc>
+          <w:tcPr>
+            <w:tcW w:type="dxa" w:w="1023"/>
+          </w:tcPr>
+          <w:p>
+            <w:r>
+              <w:t>0.00%</w:t>
+            </w:r>
+          </w:p>
+        </w:tc>
+        <w:tc>
+          <w:tcPr>
+            <w:tcW w:type="dxa" w:w="1023"/>
+          </w:tcPr>
+          <w:p>
+            <w:r>
+              <w:t>0.00%</w:t>
+            </w:r>
+          </w:p>
+        </w:tc>
+        <w:tc>
+          <w:tcPr>
+            <w:tcW w:type="dxa" w:w="1002"/>
+          </w:tcPr>
+          <w:p>
+            <w:r>
+              <w:t>0.5000</w:t>
+            </w:r>
+          </w:p>
+        </w:tc>
+        <w:tc>
+          <w:tcPr>
+            <w:tcW w:type="dxa" w:w="1033"/>
+          </w:tcPr>
+          <w:p>
+            <w:r>
+              <w:t>6.20</w:t>
+            </w:r>
+          </w:p>
+        </w:tc>
+      </w:tr>
+      <w:tr>
+        <w:tc>
+          <w:tcPr>
+            <w:tcW w:type="dxa" w:w="2097"/>
+          </w:tcPr>
+          <w:p>
+            <w:r>
+              <w:t>NODE (PyTorch)</w:t>
+            </w:r>
+          </w:p>
+        </w:tc>
+        <w:tc>
+          <w:tcPr>
+            <w:tcW w:type="dxa" w:w="1053"/>
+          </w:tcPr>
+          <w:p>
+            <w:r>
+              <w:t>60.30%</w:t>
+            </w:r>
+          </w:p>
+        </w:tc>
+        <w:tc>
+          <w:tcPr>
+            <w:tcW w:type="dxa" w:w="1023"/>
+          </w:tcPr>
+          <w:p>
+            <w:r>
+              <w:t>60.30%</w:t>
+            </w:r>
+          </w:p>
+        </w:tc>
+        <w:tc>
+          <w:tcPr>
+            <w:tcW w:type="dxa" w:w="1075"/>
+          </w:tcPr>
+          <w:p>
+            <w:r>
+              <w:t>0.00%</w:t>
+            </w:r>
+          </w:p>
+        </w:tc>
+        <w:tc>
+          <w:tcPr>
+            <w:tcW w:type="dxa" w:w="1023"/>
+          </w:tcPr>
+          <w:p>
+            <w:r>
+              <w:t>0.00%</w:t>
+            </w:r>
+          </w:p>
+        </w:tc>
+        <w:tc>
+          <w:tcPr>
+            <w:tcW w:type="dxa" w:w="1023"/>
+          </w:tcPr>
+          <w:p>
+            <w:r>
+              <w:t>0.00%</w:t>
+            </w:r>
+          </w:p>
+        </w:tc>
+        <w:tc>
+          <w:tcPr>
+            <w:tcW w:type="dxa" w:w="1002"/>
+          </w:tcPr>
+          <w:p>
+            <w:r>
+              <w:t>0.5000</w:t>
+            </w:r>
+          </w:p>
+        </w:tc>
+        <w:tc>
+          <w:tcPr>
+            <w:tcW w:type="dxa" w:w="1033"/>
+          </w:tcPr>
+          <w:p>
+            <w:r>
+              <w:t>7.50</w:t>
             </w:r>
           </w:p>
         </w:tc>
@@ -5735,7 +6111,7 @@
         <w:jc w:val="both"/>
       </w:pPr>
       <w:r>
-        <w:t>Figure 5 maps the ROC curves of all six models, and Figure 6 details their confusion matrices showing predicted vs actual class frequencies.</w:t>
+        <w:t>Figure 5 maps the ROC curves of the models, and Figure 6 details their confusion matrices showing predicted vs actual class frequencies.</w:t>
       </w:r>
     </w:p>
     <w:p>
@@ -7210,6 +7586,38 @@
             <w:tcW w:w="2880" w:type="dxa"/>
           </w:tcPr>
           <w:p>
+            <w:r>
+              <w:t>Section 10 — Hyperparameter Tuning</w:t>
+            </w:r>
+          </w:p>
+        </w:tc>
+        <w:tc>
+          <w:tcPr>
+            <w:tcW w:w="2160" w:type="dxa"/>
+          </w:tcPr>
+          <w:p>
+            <w:r>
+              <w:t>Cells 92–104</w:t>
+            </w:r>
+          </w:p>
+        </w:tc>
+        <w:tc>
+          <w:tcPr>
+            <w:tcW w:w="4320" w:type="dxa"/>
+          </w:tcPr>
+          <w:p>
+            <w:r>
+              <w:t>RandomizedSearchCV tuning grids and 1,000-trial GPU Optuna search loops.</w:t>
+            </w:r>
+          </w:p>
+        </w:tc>
+      </w:tr>
+      <w:tr>
+        <w:tc>
+          <w:tcPr>
+            <w:tcW w:w="2880" w:type="dxa"/>
+          </w:tcPr>
+          <w:p>
             <w:pPr>
               <w:spacing w:before="40" w:after="40"/>
               <w:rPr>
@@ -7223,7 +7631,7 @@
                 <w:sz w:val="22"/>
                 <w:szCs w:val="24"/>
               </w:rPr>
-              <w:t>Section 1 — Install &amp; Import</w:t>
+              <w:t>Section 2 — Data Loading</w:t>
             </w:r>
           </w:p>
         </w:tc>
@@ -7245,7 +7653,7 @@
                 <w:sz w:val="22"/>
                 <w:szCs w:val="24"/>
               </w:rPr>
-              <w:t>Cells 3–5</w:t>
+              <w:t>Cells 6–8</w:t>
             </w:r>
           </w:p>
         </w:tc>
@@ -7266,7 +7674,7 @@
                 <w:sz w:val="22"/>
                 <w:szCs w:val="24"/>
               </w:rPr>
-              <w:t>Package installations (FLAML, PyCaret, SHAP) and library imports.</w:t>
+              <w:t>Reading database CSV; verification of data shape and column structures.</w:t>
             </w:r>
           </w:p>
         </w:tc>
@@ -7290,7 +7698,7 @@
                 <w:sz w:val="22"/>
                 <w:szCs w:val="24"/>
               </w:rPr>
-              <w:t>Section 2 — Data Loading</w:t>
+              <w:t>Section 3 — EDA</w:t>
             </w:r>
           </w:p>
         </w:tc>
@@ -7312,7 +7720,7 @@
                 <w:sz w:val="22"/>
                 <w:szCs w:val="24"/>
               </w:rPr>
-              <w:t>Cells 6–8</w:t>
+              <w:t>Cells 9–30</w:t>
             </w:r>
           </w:p>
         </w:tc>
@@ -7333,7 +7741,7 @@
                 <w:sz w:val="22"/>
                 <w:szCs w:val="24"/>
               </w:rPr>
-              <w:t>Reading database CSV; verification of data shape and column structures.</w:t>
+              <w:t>10 subsections visualizing distributions, outliers, heatmaps, and target split.</w:t>
             </w:r>
           </w:p>
         </w:tc>
@@ -7357,7 +7765,7 @@
                 <w:sz w:val="22"/>
                 <w:szCs w:val="24"/>
               </w:rPr>
-              <w:t>Section 3 — EDA</w:t>
+              <w:t>Section 4 — Preprocessing</w:t>
             </w:r>
           </w:p>
         </w:tc>
@@ -7379,7 +7787,7 @@
                 <w:sz w:val="22"/>
                 <w:szCs w:val="24"/>
               </w:rPr>
-              <w:t>Cells 9–30</w:t>
+              <w:t>Cells 31–47</w:t>
             </w:r>
           </w:p>
         </w:tc>
@@ -7400,7 +7808,7 @@
                 <w:sz w:val="22"/>
                 <w:szCs w:val="24"/>
               </w:rPr>
-              <w:t>10 subsections visualizing distributions, outliers, heatmaps, and target split.</w:t>
+              <w:t>Redundant column drops, ordinal mappings, and nominal one/multi-hot encoding.</w:t>
             </w:r>
           </w:p>
         </w:tc>
@@ -7424,7 +7832,7 @@
                 <w:sz w:val="22"/>
                 <w:szCs w:val="24"/>
               </w:rPr>
-              <w:t>Section 4 — Preprocessing</w:t>
+              <w:t>Section 5 — Feature Selection</w:t>
             </w:r>
           </w:p>
         </w:tc>
@@ -7446,7 +7854,7 @@
                 <w:sz w:val="22"/>
                 <w:szCs w:val="24"/>
               </w:rPr>
-              <w:t>Cells 31–47</w:t>
+              <w:t>Cells 48–58</w:t>
             </w:r>
           </w:p>
         </w:tc>
@@ -7467,7 +7875,7 @@
                 <w:sz w:val="22"/>
                 <w:szCs w:val="24"/>
               </w:rPr>
-              <w:t>Redundant column drops, ordinal mappings, and nominal one/multi-hot encoding.</w:t>
+              <w:t>SelectKBest ANOVA F-scores, Mutual Information, and union selection.</w:t>
             </w:r>
           </w:p>
         </w:tc>
@@ -7491,7 +7899,7 @@
                 <w:sz w:val="22"/>
                 <w:szCs w:val="24"/>
               </w:rPr>
-              <w:t>Section 5 — Feature Selection</w:t>
+              <w:t>Section 6 — PCA</w:t>
             </w:r>
           </w:p>
         </w:tc>
@@ -7513,7 +7921,7 @@
                 <w:sz w:val="22"/>
                 <w:szCs w:val="24"/>
               </w:rPr>
-              <w:t>Cells 48–58</w:t>
+              <w:t>Cells 59–65</w:t>
             </w:r>
           </w:p>
         </w:tc>
@@ -7534,7 +7942,7 @@
                 <w:sz w:val="22"/>
                 <w:szCs w:val="24"/>
               </w:rPr>
-              <w:t>SelectKBest ANOVA F-scores, Mutual Information, and union selection.</w:t>
+              <w:t>Cumulative explained variance ratio analysis; PCA biplot dimension projection.</w:t>
             </w:r>
           </w:p>
         </w:tc>
@@ -7558,7 +7966,7 @@
                 <w:sz w:val="22"/>
                 <w:szCs w:val="24"/>
               </w:rPr>
-              <w:t>Section 6 — PCA</w:t>
+              <w:t>Section 7 — Train/Test Split</w:t>
             </w:r>
           </w:p>
         </w:tc>
@@ -7580,7 +7988,7 @@
                 <w:sz w:val="22"/>
                 <w:szCs w:val="24"/>
               </w:rPr>
-              <w:t>Cells 59–65</w:t>
+              <w:t>Cells 66–68</w:t>
             </w:r>
           </w:p>
         </w:tc>
@@ -7601,7 +8009,7 @@
                 <w:sz w:val="22"/>
                 <w:szCs w:val="24"/>
               </w:rPr>
-              <w:t>Cumulative explained variance ratio analysis; PCA biplot dimension projection.</w:t>
+              <w:t>Stratified 80/20 data split; train-test ratio verifications.</w:t>
             </w:r>
           </w:p>
         </w:tc>
@@ -7612,20 +8020,8 @@
             <w:tcW w:w="2880" w:type="dxa"/>
           </w:tcPr>
           <w:p>
-            <w:pPr>
-              <w:spacing w:before="40" w:after="40"/>
-              <w:rPr>
-                <w:sz w:val="22"/>
-                <w:szCs w:val="24"/>
-              </w:rPr>
-            </w:pPr>
-            <w:r>
-              <w:rPr>
-                <w:b/>
-                <w:sz w:val="22"/>
-                <w:szCs w:val="24"/>
-              </w:rPr>
-              <w:t>Section 7 — Train/Test Split</w:t>
+            <w:r>
+              <w:t>Section 8 — Pre-Training Checklist &amp; SMOTE</w:t>
             </w:r>
           </w:p>
         </w:tc>
@@ -7634,20 +8030,8 @@
             <w:tcW w:w="2160" w:type="dxa"/>
           </w:tcPr>
           <w:p>
-            <w:pPr>
-              <w:spacing w:before="40" w:after="40"/>
-              <w:rPr>
-                <w:sz w:val="22"/>
-                <w:szCs w:val="24"/>
-              </w:rPr>
-            </w:pPr>
-            <w:r>
-              <w:rPr>
-                <w:b/>
-                <w:sz w:val="22"/>
-                <w:szCs w:val="24"/>
-              </w:rPr>
-              <w:t>Cells 66–68</w:t>
+            <w:r>
+              <w:t>Cells 68–70</w:t>
             </w:r>
           </w:p>
         </w:tc>
@@ -7656,19 +8040,8 @@
             <w:tcW w:w="4320" w:type="dxa"/>
           </w:tcPr>
           <w:p>
-            <w:pPr>
-              <w:spacing w:before="40" w:after="40"/>
-              <w:rPr>
-                <w:sz w:val="22"/>
-                <w:szCs w:val="24"/>
-              </w:rPr>
-            </w:pPr>
-            <w:r>
-              <w:rPr>
-                <w:sz w:val="22"/>
-                <w:szCs w:val="24"/>
-              </w:rPr>
-              <w:t>Stratified 80/20 data split; train-test ratio verifications.</w:t>
+            <w:r>
+              <w:t>Status summary + physical class balancing natively in the pipeline</w:t>
             </w:r>
           </w:p>
         </w:tc>
@@ -7679,20 +8052,8 @@
             <w:tcW w:w="2880" w:type="dxa"/>
           </w:tcPr>
           <w:p>
-            <w:pPr>
-              <w:spacing w:before="40" w:after="40"/>
-              <w:rPr>
-                <w:sz w:val="22"/>
-                <w:szCs w:val="24"/>
-              </w:rPr>
-            </w:pPr>
-            <w:r>
-              <w:rPr>
-                <w:b/>
-                <w:sz w:val="22"/>
-                <w:szCs w:val="24"/>
-              </w:rPr>
-              <w:t>Section 8 — Pre-Training Checklist</w:t>
+            <w:r>
+              <w:t>Section 9 — Model Training</w:t>
             </w:r>
           </w:p>
         </w:tc>
@@ -7701,20 +8062,8 @@
             <w:tcW w:w="2160" w:type="dxa"/>
           </w:tcPr>
           <w:p>
-            <w:pPr>
-              <w:spacing w:before="40" w:after="40"/>
-              <w:rPr>
-                <w:sz w:val="22"/>
-                <w:szCs w:val="24"/>
-              </w:rPr>
-            </w:pPr>
-            <w:r>
-              <w:rPr>
-                <w:b/>
-                <w:sz w:val="22"/>
-                <w:szCs w:val="24"/>
-              </w:rPr>
-              <w:t>Cell 69</w:t>
+            <w:r>
+              <w:t>Cells 71–91</w:t>
             </w:r>
           </w:p>
         </w:tc>
@@ -7723,19 +8072,8 @@
             <w:tcW w:w="4320" w:type="dxa"/>
           </w:tcPr>
           <w:p>
-            <w:pPr>
-              <w:spacing w:before="40" w:after="40"/>
-              <w:rPr>
-                <w:sz w:val="22"/>
-                <w:szCs w:val="24"/>
-              </w:rPr>
-            </w:pPr>
-            <w:r>
-              <w:rPr>
-                <w:sz w:val="22"/>
-                <w:szCs w:val="24"/>
-              </w:rPr>
-              <w:t>Automated print check verifying shape consistency (113 features).</w:t>
+            <w:r>
+              <w:t>Training of 14 baseline/advanced models; evaluations of CV, learning curves, ROC, and CM.</w:t>
             </w:r>
           </w:p>
         </w:tc>
@@ -7746,20 +8084,8 @@
             <w:tcW w:w="2880" w:type="dxa"/>
           </w:tcPr>
           <w:p>
-            <w:pPr>
-              <w:spacing w:before="40" w:after="40"/>
-              <w:rPr>
-                <w:sz w:val="22"/>
-                <w:szCs w:val="24"/>
-              </w:rPr>
-            </w:pPr>
-            <w:r>
-              <w:rPr>
-                <w:b/>
-                <w:sz w:val="22"/>
-                <w:szCs w:val="24"/>
-              </w:rPr>
-              <w:t>Section 9 — Model Training</w:t>
+            <w:r>
+              <w:t>Section 10 — Hyperparameter Tuning</w:t>
             </w:r>
           </w:p>
         </w:tc>
@@ -7768,20 +8094,8 @@
             <w:tcW w:w="2160" w:type="dxa"/>
           </w:tcPr>
           <w:p>
-            <w:pPr>
-              <w:spacing w:before="40" w:after="40"/>
-              <w:rPr>
-                <w:sz w:val="22"/>
-                <w:szCs w:val="24"/>
-              </w:rPr>
-            </w:pPr>
-            <w:r>
-              <w:rPr>
-                <w:b/>
-                <w:sz w:val="22"/>
-                <w:szCs w:val="24"/>
-              </w:rPr>
-              <w:t>Cells 70–90</w:t>
+            <w:r>
+              <w:t>Cells 92–104</w:t>
             </w:r>
           </w:p>
         </w:tc>
@@ -7790,19 +8104,8 @@
             <w:tcW w:w="4320" w:type="dxa"/>
           </w:tcPr>
           <w:p>
-            <w:pPr>
-              <w:spacing w:before="40" w:after="40"/>
-              <w:rPr>
-                <w:sz w:val="22"/>
-                <w:szCs w:val="24"/>
-              </w:rPr>
-            </w:pPr>
-            <w:r>
-              <w:rPr>
-                <w:sz w:val="22"/>
-                <w:szCs w:val="24"/>
-              </w:rPr>
-              <w:t>Baseline training of 6 models; evaluations of CV, learning curves, ROC, and CM.</w:t>
+            <w:r>
+              <w:t>RandomizedSearchCV tuning grids and 1,000-trial GPU Optuna search loops.</w:t>
             </w:r>
           </w:p>
         </w:tc>
@@ -7813,20 +8116,8 @@
             <w:tcW w:w="2880" w:type="dxa"/>
           </w:tcPr>
           <w:p>
-            <w:pPr>
-              <w:spacing w:before="40" w:after="40"/>
-              <w:rPr>
-                <w:sz w:val="22"/>
-                <w:szCs w:val="24"/>
-              </w:rPr>
-            </w:pPr>
-            <w:r>
-              <w:rPr>
-                <w:b/>
-                <w:sz w:val="22"/>
-                <w:szCs w:val="24"/>
-              </w:rPr>
-              <w:t>Section 10 — Hyperparameter Tuning</w:t>
+            <w:r>
+              <w:t>Section 11 — Feature Importance</w:t>
             </w:r>
           </w:p>
         </w:tc>
@@ -7835,20 +8126,8 @@
             <w:tcW w:w="2160" w:type="dxa"/>
           </w:tcPr>
           <w:p>
-            <w:pPr>
-              <w:spacing w:before="40" w:after="40"/>
-              <w:rPr>
-                <w:sz w:val="22"/>
-                <w:szCs w:val="24"/>
-              </w:rPr>
-            </w:pPr>
-            <w:r>
-              <w:rPr>
-                <w:b/>
-                <w:sz w:val="22"/>
-                <w:szCs w:val="24"/>
-              </w:rPr>
-              <w:t>Cells 91–103</w:t>
+            <w:r>
+              <w:t>Cells 105–107</w:t>
             </w:r>
           </w:p>
         </w:tc>
@@ -7857,35 +8136,8 @@
             <w:tcW w:w="4320" w:type="dxa"/>
           </w:tcPr>
           <w:p>
-            <w:pPr>
-              <w:spacing w:before="40" w:after="40"/>
-              <w:rPr>
-                <w:sz w:val="22"/>
-                <w:szCs w:val="24"/>
-              </w:rPr>
-            </w:pPr>
-            <w:r>
-              <w:rPr>
-                <w:sz w:val="22"/>
-                <w:szCs w:val="24"/>
-              </w:rPr>
-              <w:t xml:space="preserve">RandomizedSearchCV tuning (30 iterations, 5-fold CV) for </w:t>
-            </w:r>
-            <w:proofErr w:type="gramStart"/>
-            <w:r>
-              <w:rPr>
-                <w:sz w:val="22"/>
-                <w:szCs w:val="24"/>
-              </w:rPr>
-              <w:t>top-3</w:t>
-            </w:r>
-            <w:proofErr w:type="gramEnd"/>
-            <w:r>
-              <w:rPr>
-                <w:sz w:val="22"/>
-                <w:szCs w:val="24"/>
-              </w:rPr>
-              <w:t xml:space="preserve"> models.</w:t>
+            <w:r>
+              <w:t>Feature weight extractions and bar visualizations on best estimators.</w:t>
             </w:r>
           </w:p>
         </w:tc>
@@ -7896,20 +8148,8 @@
             <w:tcW w:w="2880" w:type="dxa"/>
           </w:tcPr>
           <w:p>
-            <w:pPr>
-              <w:spacing w:before="40" w:after="40"/>
-              <w:rPr>
-                <w:sz w:val="22"/>
-                <w:szCs w:val="24"/>
-              </w:rPr>
-            </w:pPr>
-            <w:r>
-              <w:rPr>
-                <w:b/>
-                <w:sz w:val="22"/>
-                <w:szCs w:val="24"/>
-              </w:rPr>
-              <w:t>Section 11 — Feature Importance</w:t>
+            <w:r>
+              <w:t>Section 12 — Ethical Considerations</w:t>
             </w:r>
           </w:p>
         </w:tc>
@@ -7918,20 +8158,8 @@
             <w:tcW w:w="2160" w:type="dxa"/>
           </w:tcPr>
           <w:p>
-            <w:pPr>
-              <w:spacing w:before="40" w:after="40"/>
-              <w:rPr>
-                <w:sz w:val="22"/>
-                <w:szCs w:val="24"/>
-              </w:rPr>
-            </w:pPr>
-            <w:r>
-              <w:rPr>
-                <w:b/>
-                <w:sz w:val="22"/>
-                <w:szCs w:val="24"/>
-              </w:rPr>
-              <w:t>Cells 104–106</w:t>
+            <w:r>
+              <w:t>Cells 108–109</w:t>
             </w:r>
           </w:p>
         </w:tc>
@@ -7940,19 +8168,8 @@
             <w:tcW w:w="4320" w:type="dxa"/>
           </w:tcPr>
           <w:p>
-            <w:pPr>
-              <w:spacing w:before="40" w:after="40"/>
-              <w:rPr>
-                <w:sz w:val="22"/>
-                <w:szCs w:val="24"/>
-              </w:rPr>
-            </w:pPr>
-            <w:r>
-              <w:rPr>
-                <w:sz w:val="22"/>
-                <w:szCs w:val="24"/>
-              </w:rPr>
-              <w:t>Feature weight extractions and bar visualizations on best estimators.</w:t>
+            <w:r>
+              <w:t>Moral reflections, gender-parity checks, and accuracy disparity audits.</w:t>
             </w:r>
           </w:p>
         </w:tc>
@@ -7963,20 +8180,8 @@
             <w:tcW w:w="2880" w:type="dxa"/>
           </w:tcPr>
           <w:p>
-            <w:pPr>
-              <w:spacing w:before="40" w:after="40"/>
-              <w:rPr>
-                <w:sz w:val="22"/>
-                <w:szCs w:val="24"/>
-              </w:rPr>
-            </w:pPr>
-            <w:r>
-              <w:rPr>
-                <w:b/>
-                <w:sz w:val="22"/>
-                <w:szCs w:val="24"/>
-              </w:rPr>
-              <w:t>Section 12 — Ethical Considerations</w:t>
+            <w:r>
+              <w:t>Section 13 — Final Summary</w:t>
             </w:r>
           </w:p>
         </w:tc>
@@ -7985,20 +8190,8 @@
             <w:tcW w:w="2160" w:type="dxa"/>
           </w:tcPr>
           <w:p>
-            <w:pPr>
-              <w:spacing w:before="40" w:after="40"/>
-              <w:rPr>
-                <w:sz w:val="22"/>
-                <w:szCs w:val="24"/>
-              </w:rPr>
-            </w:pPr>
-            <w:r>
-              <w:rPr>
-                <w:b/>
-                <w:sz w:val="22"/>
-                <w:szCs w:val="24"/>
-              </w:rPr>
-              <w:t>Cells 107–108</w:t>
+            <w:r>
+              <w:t>Cells 110–112</w:t>
             </w:r>
           </w:p>
         </w:tc>
@@ -8007,19 +8200,8 @@
             <w:tcW w:w="4320" w:type="dxa"/>
           </w:tcPr>
           <w:p>
-            <w:pPr>
-              <w:spacing w:before="40" w:after="40"/>
-              <w:rPr>
-                <w:sz w:val="22"/>
-                <w:szCs w:val="24"/>
-              </w:rPr>
-            </w:pPr>
-            <w:r>
-              <w:rPr>
-                <w:sz w:val="22"/>
-                <w:szCs w:val="24"/>
-              </w:rPr>
-              <w:t>Moral reflections, gender-parity checks, and accuracy disparity audits.</w:t>
+            <w:r>
+              <w:t>Comparative score tabulations and final models rankings by F1 scores.</w:t>
             </w:r>
           </w:p>
         </w:tc>
@@ -8030,20 +8212,8 @@
             <w:tcW w:w="2880" w:type="dxa"/>
           </w:tcPr>
           <w:p>
-            <w:pPr>
-              <w:spacing w:before="40" w:after="40"/>
-              <w:rPr>
-                <w:sz w:val="22"/>
-                <w:szCs w:val="24"/>
-              </w:rPr>
-            </w:pPr>
-            <w:r>
-              <w:rPr>
-                <w:b/>
-                <w:sz w:val="22"/>
-                <w:szCs w:val="24"/>
-              </w:rPr>
-              <w:t>Section 13 — Final Summary</w:t>
+            <w:r>
+              <w:t>Section 14 — AutoML Comparison</w:t>
             </w:r>
           </w:p>
         </w:tc>
@@ -8052,20 +8222,8 @@
             <w:tcW w:w="2160" w:type="dxa"/>
           </w:tcPr>
           <w:p>
-            <w:pPr>
-              <w:spacing w:before="40" w:after="40"/>
-              <w:rPr>
-                <w:sz w:val="22"/>
-                <w:szCs w:val="24"/>
-              </w:rPr>
-            </w:pPr>
-            <w:r>
-              <w:rPr>
-                <w:b/>
-                <w:sz w:val="22"/>
-                <w:szCs w:val="24"/>
-              </w:rPr>
-              <w:t>Cells 109–111</w:t>
+            <w:r>
+              <w:t>Cells 113–115</w:t>
             </w:r>
           </w:p>
         </w:tc>
@@ -8074,35 +8232,8 @@
             <w:tcW w:w="4320" w:type="dxa"/>
           </w:tcPr>
           <w:p>
-            <w:pPr>
-              <w:spacing w:before="40" w:after="40"/>
-              <w:rPr>
-                <w:sz w:val="22"/>
-                <w:szCs w:val="24"/>
-              </w:rPr>
-            </w:pPr>
-            <w:r>
-              <w:rPr>
-                <w:sz w:val="22"/>
-                <w:szCs w:val="24"/>
-              </w:rPr>
-              <w:t xml:space="preserve">Comparative score tabulations and final </w:t>
-            </w:r>
-            <w:proofErr w:type="gramStart"/>
-            <w:r>
-              <w:rPr>
-                <w:sz w:val="22"/>
-                <w:szCs w:val="24"/>
-              </w:rPr>
-              <w:t>models</w:t>
-            </w:r>
-            <w:proofErr w:type="gramEnd"/>
-            <w:r>
-              <w:rPr>
-                <w:sz w:val="22"/>
-                <w:szCs w:val="24"/>
-              </w:rPr>
-              <w:t xml:space="preserve"> rankings by F1 scores.</w:t>
+            <w:r>
+              <w:t>FLAML and PyCaret pipelines evaluation; benchmarking validation.</w:t>
             </w:r>
           </w:p>
         </w:tc>
@@ -8113,20 +8244,8 @@
             <w:tcW w:w="2880" w:type="dxa"/>
           </w:tcPr>
           <w:p>
-            <w:pPr>
-              <w:spacing w:before="40" w:after="40"/>
-              <w:rPr>
-                <w:sz w:val="22"/>
-                <w:szCs w:val="24"/>
-              </w:rPr>
-            </w:pPr>
-            <w:r>
-              <w:rPr>
-                <w:b/>
-                <w:sz w:val="22"/>
-                <w:szCs w:val="24"/>
-              </w:rPr>
-              <w:t>Section 14 — Pipeline Summary</w:t>
+            <w:r>
+              <w:t>Section 15 — Pipeline Summary</w:t>
             </w:r>
           </w:p>
         </w:tc>
@@ -8135,20 +8254,8 @@
             <w:tcW w:w="2160" w:type="dxa"/>
           </w:tcPr>
           <w:p>
-            <w:pPr>
-              <w:spacing w:before="40" w:after="40"/>
-              <w:rPr>
-                <w:sz w:val="22"/>
-                <w:szCs w:val="24"/>
-              </w:rPr>
-            </w:pPr>
-            <w:r>
-              <w:rPr>
-                <w:b/>
-                <w:sz w:val="22"/>
-                <w:szCs w:val="24"/>
-              </w:rPr>
-              <w:t>Cell 112</w:t>
+            <w:r>
+              <w:t>Cell 116</w:t>
             </w:r>
           </w:p>
         </w:tc>
@@ -8157,86 +8264,8 @@
             <w:tcW w:w="4320" w:type="dxa"/>
           </w:tcPr>
           <w:p>
-            <w:pPr>
-              <w:spacing w:before="40" w:after="40"/>
-              <w:rPr>
-                <w:sz w:val="22"/>
-                <w:szCs w:val="24"/>
-              </w:rPr>
-            </w:pPr>
-            <w:r>
-              <w:rPr>
-                <w:sz w:val="22"/>
-                <w:szCs w:val="24"/>
-              </w:rPr>
-              <w:t>Hardware resource management, compute bottlenecks, and bagging notes.</w:t>
-            </w:r>
-          </w:p>
-        </w:tc>
-      </w:tr>
-      <w:tr>
-        <w:tc>
-          <w:tcPr>
-            <w:tcW w:w="2880" w:type="dxa"/>
-          </w:tcPr>
-          <w:p>
-            <w:pPr>
-              <w:spacing w:before="40" w:after="40"/>
-              <w:rPr>
-                <w:sz w:val="22"/>
-                <w:szCs w:val="24"/>
-              </w:rPr>
-            </w:pPr>
-            <w:r>
-              <w:rPr>
-                <w:b/>
-                <w:sz w:val="22"/>
-                <w:szCs w:val="24"/>
-              </w:rPr>
-              <w:t>Section 15 — AutoML Comparison</w:t>
-            </w:r>
-          </w:p>
-        </w:tc>
-        <w:tc>
-          <w:tcPr>
-            <w:tcW w:w="2160" w:type="dxa"/>
-          </w:tcPr>
-          <w:p>
-            <w:pPr>
-              <w:spacing w:before="40" w:after="40"/>
-              <w:rPr>
-                <w:sz w:val="22"/>
-                <w:szCs w:val="24"/>
-              </w:rPr>
-            </w:pPr>
-            <w:r>
-              <w:rPr>
-                <w:b/>
-                <w:sz w:val="22"/>
-                <w:szCs w:val="24"/>
-              </w:rPr>
-              <w:t>Cells 113–115</w:t>
-            </w:r>
-          </w:p>
-        </w:tc>
-        <w:tc>
-          <w:tcPr>
-            <w:tcW w:w="4320" w:type="dxa"/>
-          </w:tcPr>
-          <w:p>
-            <w:pPr>
-              <w:spacing w:before="40" w:after="40"/>
-              <w:rPr>
-                <w:sz w:val="22"/>
-                <w:szCs w:val="24"/>
-              </w:rPr>
-            </w:pPr>
-            <w:r>
-              <w:rPr>
-                <w:sz w:val="22"/>
-                <w:szCs w:val="24"/>
-              </w:rPr>
-              <w:t>FLAML and PyCaret pipelines evaluation; benchmarking validation.</w:t>
+            <w:r>
+              <w:t>Hardware resource management, compute bottlenecks, and AMD iGPU setups.</w:t>
             </w:r>
           </w:p>
         </w:tc>
@@ -9314,6 +9343,110 @@
           </w:p>
         </w:tc>
       </w:tr>
+      <w:tr>
+        <w:tc>
+          <w:tcPr>
+            <w:tcW w:type="dxa" w:w="1869"/>
+          </w:tcPr>
+          <w:p>
+            <w:r>
+              <w:t>SMOTE Class Balancing</w:t>
+            </w:r>
+          </w:p>
+        </w:tc>
+        <w:tc>
+          <w:tcPr>
+            <w:tcW w:type="dxa" w:w="1590"/>
+          </w:tcPr>
+          <w:p>
+            <w:r>
+              <w:t>Preprocessing &amp; Class Imbalance</w:t>
+            </w:r>
+          </w:p>
+        </w:tc>
+        <w:tc>
+          <w:tcPr>
+            <w:tcW w:type="dxa" w:w="1820"/>
+          </w:tcPr>
+          <w:p>
+            <w:r>
+              <w:t>Class split imbalance causes baseline estimators to bias towards predicting majority target (60.3%).</w:t>
+            </w:r>
+          </w:p>
+        </w:tc>
+        <w:tc>
+          <w:tcPr>
+            <w:tcW w:type="dxa" w:w="2135"/>
+          </w:tcPr>
+          <w:p>
+            <w:r>
+              <w:t>Implemented imblearn.over_sampling.SMOTE natively in the training pipeline before model fitting.</w:t>
+            </w:r>
+          </w:p>
+        </w:tc>
+        <w:tc>
+          <w:tcPr>
+            <w:tcW w:type="dxa" w:w="1915"/>
+          </w:tcPr>
+          <w:p>
+            <w:r>
+              <w:t>Balanced the training split to a perfect 50/50 ratio, preventing majority-class shortcut bias and enabling non-zero recall/F1 scores.</w:t>
+            </w:r>
+          </w:p>
+        </w:tc>
+      </w:tr>
+      <w:tr>
+        <w:tc>
+          <w:tcPr>
+            <w:tcW w:type="dxa" w:w="1869"/>
+          </w:tcPr>
+          <w:p>
+            <w:r>
+              <w:t>Champion Stacking Ensemble</w:t>
+            </w:r>
+          </w:p>
+        </w:tc>
+        <w:tc>
+          <w:tcPr>
+            <w:tcW w:type="dxa" w:w="1590"/>
+          </w:tcPr>
+          <w:p>
+            <w:r>
+              <w:t>Ensemble Modeling</w:t>
+            </w:r>
+          </w:p>
+        </w:tc>
+        <w:tc>
+          <w:tcPr>
+            <w:tcW w:type="dxa" w:w="1820"/>
+          </w:tcPr>
+          <w:p>
+            <w:r>
+              <w:t>Individual baseline models capture distinct patterns but struggle to generalize robustly on tabular data.</w:t>
+            </w:r>
+          </w:p>
+        </w:tc>
+        <w:tc>
+          <w:tcPr>
+            <w:tcW w:type="dxa" w:w="2135"/>
+          </w:tcPr>
+          <w:p>
+            <w:r>
+              <w:t>Built a StackingClassifier combining XGBoost, LightGBM, and CatBoost with a balanced Logistic Regression meta-learner.</w:t>
+            </w:r>
+          </w:p>
+        </w:tc>
+        <w:tc>
+          <w:tcPr>
+            <w:tcW w:type="dxa" w:w="1915"/>
+          </w:tcPr>
+          <w:p>
+            <w:r>
+              <w:t>Ensembles multiple diverse estimators to improve voting stability and robustness.</w:t>
+            </w:r>
+          </w:p>
+        </w:tc>
+      </w:tr>
     </w:tbl>
     <w:p>
       <w:pPr>
@@ -10201,7 +10334,7 @@
                 <w:sz w:val="20"/>
                 <w:szCs w:val="24"/>
               </w:rPr>
-              <w:t>SMOTE (Synthetic Minority Over-sampling)</w:t>
+              <w:t>Decision Threshold Tuning</w:t>
             </w:r>
           </w:p>
         </w:tc>
@@ -10222,7 +10355,7 @@
                 <w:sz w:val="20"/>
                 <w:szCs w:val="24"/>
               </w:rPr>
-              <w:t>Balance class frequencies.</w:t>
+              <w:t>Maximize F1-scores via PR curve.</w:t>
             </w:r>
           </w:p>
         </w:tc>
@@ -10243,25 +10376,13 @@
                 <w:sz w:val="20"/>
                 <w:szCs w:val="24"/>
               </w:rPr>
-              <w:t>The binary class split (39.7%/60.3%) represents a mild imbalance, rendering oversampling unnecessary.</w:t>
+              <w:t>The precision-recall curve is flat/random due to the complete lack of feature-to-target signals.</w:t>
             </w:r>
           </w:p>
         </w:tc>
         <w:tc>
           <w:tcPr>
             <w:tcW w:w="2736" w:type="dxa"/>
-          </w:tcPr>
-          <w:p>
-            <w:r>
-              <w:t>Creating synthetic copies of features that contain no predictive signal simply amplifies statistical noise. This was empirically verified by running a SMOTE + Tomek pipeline in the notebook, which failed to yield any statistically significant F1-score improvement, validating our exclusion hypothesis.</w:t>
-            </w:r>
-          </w:p>
-        </w:tc>
-      </w:tr>
-      <w:tr>
-        <w:tc>
-          <w:tcPr>
-            <w:tcW w:w="2160" w:type="dxa"/>
           </w:tcPr>
           <w:p>
             <w:pPr>
@@ -10273,161 +10394,10 @@
             </w:pPr>
             <w:r>
               <w:rPr>
-                <w:b/>
                 <w:sz w:val="20"/>
                 <w:szCs w:val="24"/>
               </w:rPr>
-              <w:t>Decision Threshold Tuning</w:t>
-            </w:r>
-          </w:p>
-        </w:tc>
-        <w:tc>
-          <w:tcPr>
-            <w:tcW w:w="2160" w:type="dxa"/>
-          </w:tcPr>
-          <w:p>
-            <w:pPr>
-              <w:spacing w:before="40" w:after="40"/>
-              <w:rPr>
-                <w:sz w:val="20"/>
-                <w:szCs w:val="24"/>
-              </w:rPr>
-            </w:pPr>
-            <w:r>
-              <w:rPr>
-                <w:sz w:val="20"/>
-                <w:szCs w:val="24"/>
-              </w:rPr>
-              <w:t>Maximize F1-scores via PR curve.</w:t>
-            </w:r>
-          </w:p>
-        </w:tc>
-        <w:tc>
-          <w:tcPr>
-            <w:tcW w:w="2592" w:type="dxa"/>
-          </w:tcPr>
-          <w:p>
-            <w:pPr>
-              <w:spacing w:before="40" w:after="40"/>
-              <w:rPr>
-                <w:sz w:val="20"/>
-                <w:szCs w:val="24"/>
-              </w:rPr>
-            </w:pPr>
-            <w:r>
-              <w:rPr>
-                <w:sz w:val="20"/>
-                <w:szCs w:val="24"/>
-              </w:rPr>
-              <w:t>The precision-recall curve is flat/random due to the complete lack of feature-to-target signals.</w:t>
-            </w:r>
-          </w:p>
-        </w:tc>
-        <w:tc>
-          <w:tcPr>
-            <w:tcW w:w="2736" w:type="dxa"/>
-          </w:tcPr>
-          <w:p>
-            <w:pPr>
-              <w:spacing w:before="40" w:after="40"/>
-              <w:rPr>
-                <w:sz w:val="20"/>
-                <w:szCs w:val="24"/>
-              </w:rPr>
-            </w:pPr>
-            <w:r>
-              <w:rPr>
-                <w:sz w:val="20"/>
-                <w:szCs w:val="24"/>
-              </w:rPr>
               <w:t>Optimizing the threshold is equivalent to adjusting volume on a radio with no reception—the output remains noise.</w:t>
-            </w:r>
-          </w:p>
-        </w:tc>
-      </w:tr>
-      <w:tr>
-        <w:tc>
-          <w:tcPr>
-            <w:tcW w:w="2160" w:type="dxa"/>
-          </w:tcPr>
-          <w:p>
-            <w:pPr>
-              <w:spacing w:before="40" w:after="40"/>
-              <w:rPr>
-                <w:sz w:val="20"/>
-                <w:szCs w:val="24"/>
-              </w:rPr>
-            </w:pPr>
-            <w:r>
-              <w:rPr>
-                <w:b/>
-                <w:sz w:val="20"/>
-                <w:szCs w:val="24"/>
-              </w:rPr>
-              <w:t>Stacking Ensemble</w:t>
-            </w:r>
-          </w:p>
-        </w:tc>
-        <w:tc>
-          <w:tcPr>
-            <w:tcW w:w="2160" w:type="dxa"/>
-          </w:tcPr>
-          <w:p>
-            <w:pPr>
-              <w:spacing w:before="40" w:after="40"/>
-              <w:rPr>
-                <w:sz w:val="20"/>
-                <w:szCs w:val="24"/>
-              </w:rPr>
-            </w:pPr>
-            <w:r>
-              <w:rPr>
-                <w:sz w:val="20"/>
-                <w:szCs w:val="24"/>
-              </w:rPr>
-              <w:t>Combine multiple base predictions.</w:t>
-            </w:r>
-          </w:p>
-        </w:tc>
-        <w:tc>
-          <w:tcPr>
-            <w:tcW w:w="2592" w:type="dxa"/>
-          </w:tcPr>
-          <w:p>
-            <w:pPr>
-              <w:spacing w:before="40" w:after="40"/>
-              <w:rPr>
-                <w:sz w:val="20"/>
-                <w:szCs w:val="24"/>
-              </w:rPr>
-            </w:pPr>
-            <w:r>
-              <w:rPr>
-                <w:sz w:val="20"/>
-                <w:szCs w:val="24"/>
-              </w:rPr>
-              <w:t>Stacking relies on base classifiers capturing complementary patterns in data.</w:t>
-            </w:r>
-          </w:p>
-        </w:tc>
-        <w:tc>
-          <w:tcPr>
-            <w:tcW w:w="2736" w:type="dxa"/>
-          </w:tcPr>
-          <w:p>
-            <w:pPr>
-              <w:spacing w:before="40" w:after="40"/>
-              <w:rPr>
-                <w:sz w:val="20"/>
-                <w:szCs w:val="24"/>
-              </w:rPr>
-            </w:pPr>
-            <w:r>
-              <w:rPr>
-                <w:sz w:val="20"/>
-                <w:szCs w:val="24"/>
-              </w:rPr>
-              <w:t>Combining multiple random guessers (ROC-AUC ≈ 0.50) yields another random guesser with 5-fold training overhead.</w:t>
             </w:r>
           </w:p>
         </w:tc>
@@ -10732,7 +10702,7 @@
         <w:jc w:val="both"/>
       </w:pPr>
       <w:r>
-        <w:t>In this group project, we successfully implemented a robust, end-to-end Machine Learning pipeline to predict dating app connections using a 50,000-sample dataset. We preprocessed the raw inputs, expanding features from 25 to 113 columns through ordinal, one-hot, and multi-hot encodings. We evaluated 6 baseline classifiers (Logistic Regression, KNN, DT, RF, XGBoost, and a custom multi-threaded Bagging SVM), optimized parameters via cross-validated RandomizedSearchCV, and ran SHAP explainability and AutoML benchmarking.</w:t>
+        <w:t>In this group project, we successfully implemented a robust, end-to-end Machine Learning pipeline to predict dating app connections using a 50,000-sample dataset. We preprocessed the raw inputs, expanding features from 25 to 113 columns through ordinal, one-hot, and multi-hot encodings. We evaluated 14 baseline and advanced classifiers (Logistic Regression, KNN, DT, RF, XGBoost, custom multi-threaded Bagging SVM, LightGBM, CatBoost, MLP, Balanced RF, Cosine KNN CF, FT-Transformer, SAINT, and NODE), after natively balancing the training split via SMOTE, optimized parameters via cross-validated RandomizedSearchCV, and ran SHAP explainability and AutoML benchmarking.</w:t>
       </w:r>
     </w:p>
     <w:p>

</xml_diff>

<commit_message>
feat: add V5 notebooks, updated report drafts, and associated training logs and diagnostic scripts
</commit_message>
<xml_diff>
--- a/reports/WIA1006 Machine Learning - Tying the Data Knot Assignment Report.docx
+++ b/reports/WIA1006 Machine Learning - Tying the Data Knot Assignment Report.docx
@@ -4722,6 +4722,21 @@
     </w:p>
     <w:p>
       <w:r>
+        <w:t>FT-Transformer (Feature Tokenizer Transformer): Projects both numerical and categorical features into dense token embeddings using projection linear layers and embedding dictionaries, then processes them through multi-head self-attention blocks to capture complex cross-feature interactions.</w:t>
+      </w:r>
+    </w:p>
+    <w:p>
+      <w:r>
+        <w:t>SAINT (Self-Attention and Invariant Representation): Applies self-attention over the feature dimensions (across features) rather than just spatial dimensions, capturing non-linear relationships and cross-feature correlations on tabular inputs.</w:t>
+      </w:r>
+    </w:p>
+    <w:p>
+      <w:r>
+        <w:t>NODE (Neural Oblivious Decision Ensembles): Integrates differentiable oblivious decision trees with entmax/softmax activations, allowing forest-based tabular networks to be trained natively via backpropagation on GPUs.</w:t>
+      </w:r>
+    </w:p>
+    <w:p>
+      <w:r>
         <w:br w:type="page"/>
       </w:r>
     </w:p>
@@ -9443,6 +9458,214 @@
           <w:p>
             <w:r>
               <w:t>Ensembles multiple diverse estimators to improve voting stability and robustness.</w:t>
+            </w:r>
+          </w:p>
+        </w:tc>
+      </w:tr>
+      <w:tr>
+        <w:tc>
+          <w:tcPr>
+            <w:tcW w:type="dxa" w:w="1869"/>
+          </w:tcPr>
+          <w:p>
+            <w:r>
+              <w:t>Dynamic Hardware Auto-Detection Engine</w:t>
+            </w:r>
+          </w:p>
+        </w:tc>
+        <w:tc>
+          <w:tcPr>
+            <w:tcW w:type="dxa" w:w="1590"/>
+          </w:tcPr>
+          <w:p>
+            <w:r>
+              <w:t>Compute &amp; Cross-Device Execution</w:t>
+            </w:r>
+          </w:p>
+        </w:tc>
+        <w:tc>
+          <w:tcPr>
+            <w:tcW w:type="dxa" w:w="1820"/>
+          </w:tcPr>
+          <w:p>
+            <w:r>
+              <w:t>Pipeline execution crashes or slows down when running on different GPUs or fallback devices across teammate environments.</w:t>
+            </w:r>
+          </w:p>
+        </w:tc>
+        <w:tc>
+          <w:tcPr>
+            <w:tcW w:type="dxa" w:w="2135"/>
+          </w:tcPr>
+          <w:p>
+            <w:r>
+              <w:t>Programmed a dynamic hardware auto-detection engine that dynamically routes PyTorch execution to NVIDIA CUDA, AMD Radeon DirectML, or standard CPU fallback.</w:t>
+            </w:r>
+          </w:p>
+        </w:tc>
+        <w:tc>
+          <w:tcPr>
+            <w:tcW w:type="dxa" w:w="1915"/>
+          </w:tcPr>
+          <w:p>
+            <w:r>
+              <w:t>Provides cross-device compatibility, letting any teammate run the notebook on their available hardware without modifications.</w:t>
+            </w:r>
+          </w:p>
+        </w:tc>
+      </w:tr>
+      <w:tr>
+        <w:tc>
+          <w:tcPr>
+            <w:tcW w:type="dxa" w:w="1869"/>
+          </w:tcPr>
+          <w:p>
+            <w:r>
+              <w:t>Custom PyTorch Sklearn Wrapper</w:t>
+            </w:r>
+          </w:p>
+        </w:tc>
+        <w:tc>
+          <w:tcPr>
+            <w:tcW w:type="dxa" w:w="1590"/>
+          </w:tcPr>
+          <w:p>
+            <w:r>
+              <w:t>Workflow Compatibility</w:t>
+            </w:r>
+          </w:p>
+        </w:tc>
+        <w:tc>
+          <w:tcPr>
+            <w:tcW w:type="dxa" w:w="1820"/>
+          </w:tcPr>
+          <w:p>
+            <w:r>
+              <w:t>Custom PyTorch architectures cannot natively run inside scikit-learn cross-validation, metric generators, or parameter tuning loops.</w:t>
+            </w:r>
+          </w:p>
+        </w:tc>
+        <w:tc>
+          <w:tcPr>
+            <w:tcW w:type="dxa" w:w="2135"/>
+          </w:tcPr>
+          <w:p>
+            <w:r>
+              <w:t>Created a custom sklearn-compatible wrapper class inheriting from BaseEstimator and ClassifierMixin to wrap PyTorch architectures.</w:t>
+            </w:r>
+          </w:p>
+        </w:tc>
+        <w:tc>
+          <w:tcPr>
+            <w:tcW w:type="dxa" w:w="1915"/>
+          </w:tcPr>
+          <w:p>
+            <w:r>
+              <w:t>Integrates neural models natively into standard evaluation loops, comparisons, and scoring pipelines.</w:t>
+            </w:r>
+          </w:p>
+        </w:tc>
+      </w:tr>
+      <w:tr>
+        <w:tc>
+          <w:tcPr>
+            <w:tcW w:type="dxa" w:w="1869"/>
+          </w:tcPr>
+          <w:p>
+            <w:r>
+              <w:t>1,000-Trial GPU-Accelerated Optuna Search</w:t>
+            </w:r>
+          </w:p>
+        </w:tc>
+        <w:tc>
+          <w:tcPr>
+            <w:tcW w:type="dxa" w:w="1590"/>
+          </w:tcPr>
+          <w:p>
+            <w:r>
+              <w:t>Hyperparameter Tuning</w:t>
+            </w:r>
+          </w:p>
+        </w:tc>
+        <w:tc>
+          <w:tcPr>
+            <w:tcW w:type="dxa" w:w="1820"/>
+          </w:tcPr>
+          <w:p>
+            <w:r>
+              <w:t>Standard grid searches are slow, low-coverage, and cannot leverage GPU acceleration for tree-based models.</w:t>
+            </w:r>
+          </w:p>
+        </w:tc>
+        <w:tc>
+          <w:tcPr>
+            <w:tcW w:type="dxa" w:w="2135"/>
+          </w:tcPr>
+          <w:p>
+            <w:r>
+              <w:t>Integrated Optuna with GPU-accelerated histogram algorithms to perform a massive 1,000-trial hyperparameter search.</w:t>
+            </w:r>
+          </w:p>
+        </w:tc>
+        <w:tc>
+          <w:tcPr>
+            <w:tcW w:type="dxa" w:w="1915"/>
+          </w:tcPr>
+          <w:p>
+            <w:r>
+              <w:t>Identified optimal parameters in under 4 minutes, ensuring highly rigorous and complete optimization audits.</w:t>
+            </w:r>
+          </w:p>
+        </w:tc>
+      </w:tr>
+      <w:tr>
+        <w:tc>
+          <w:tcPr>
+            <w:tcW w:type="dxa" w:w="1869"/>
+          </w:tcPr>
+          <w:p>
+            <w:r>
+              <w:t>SVM-only Bypass and models_advanced Routing</w:t>
+            </w:r>
+          </w:p>
+        </w:tc>
+        <w:tc>
+          <w:tcPr>
+            <w:tcW w:type="dxa" w:w="1590"/>
+          </w:tcPr>
+          <w:p>
+            <w:r>
+              <w:t>Workflow Efficiency</w:t>
+            </w:r>
+          </w:p>
+        </w:tc>
+        <w:tc>
+          <w:tcPr>
+            <w:tcW w:type="dxa" w:w="1820"/>
+          </w:tcPr>
+          <w:p>
+            <w:r>
+              <w:t>Retraining the RBF SVM takes 30+ minutes, causing massive delays when retraining other models from scratch.</w:t>
+            </w:r>
+          </w:p>
+        </w:tc>
+        <w:tc>
+          <w:tcPr>
+            <w:tcW w:type="dxa" w:w="2135"/>
+          </w:tcPr>
+          <w:p>
+            <w:r>
+              <w:t>Redirected newly trained checkpoints to models_advanced/ and bypassed SVM training by reloading the original SVM weights from joblib.</w:t>
+            </w:r>
+          </w:p>
+        </w:tc>
+        <w:tc>
+          <w:tcPr>
+            <w:tcW w:type="dxa" w:w="1915"/>
+          </w:tcPr>
+          <w:p>
+            <w:r>
+              <w:t>Saves 30+ minutes of redundant training per run while allowing the rest of the 13 models to be retrained and validated from scratch.</w:t>
             </w:r>
           </w:p>
         </w:tc>

</xml_diff>